<commit_message>
Updated document and README.md
</commit_message>
<xml_diff>
--- a/ACEest_Assignment1_Deliverables.docx
+++ b/ACEest_Assignment1_Deliverables.docx
@@ -77,6 +77,13 @@
           <w:b/>
           <w:bCs/>
         </w:rPr>
+        <w:t xml:space="preserve">Git </w:t>
+      </w:r>
+      <w:r>
+        <w:rPr>
+          <w:b/>
+          <w:bCs/>
+        </w:rPr>
         <w:t>Repository</w:t>
       </w:r>
       <w:r>
@@ -1069,74 +1076,6 @@
     <w:p>
       <w:r>
         <w:t>Jenkins runs on the course Linux VM as a BUILD quality gate. The Pipeline job clones the same repository, performs a clean install and compile, runs pytest on the agent, builds Docker, and runs pytest in the image. Jenkins validates the project in a controlled server environment; GitHub Actions validates on each commit in the cloud.</w:t>
-      </w:r>
-    </w:p>
-    <w:p>
-      <w:pPr>
-        <w:pStyle w:val="Heading1"/>
-      </w:pPr>
-      <w:r>
-        <w:t>7. Submission checklist</w:t>
-      </w:r>
-    </w:p>
-    <w:p>
-      <w:pPr>
-        <w:pStyle w:val="ListBullet"/>
-        <w:numPr>
-          <w:ilvl w:val="0"/>
-          <w:numId w:val="17"/>
-        </w:numPr>
-      </w:pPr>
-      <w:r>
-        <w:t>GitHub repository link submitted</w:t>
-      </w:r>
-    </w:p>
-    <w:p>
-      <w:pPr>
-        <w:pStyle w:val="ListBullet"/>
-        <w:numPr>
-          <w:ilvl w:val="0"/>
-          <w:numId w:val="18"/>
-        </w:numPr>
-      </w:pPr>
-      <w:r>
-        <w:t>Flask source and requirements.txt</w:t>
-      </w:r>
-    </w:p>
-    <w:p>
-      <w:pPr>
-        <w:pStyle w:val="ListBullet"/>
-        <w:numPr>
-          <w:ilvl w:val="0"/>
-          <w:numId w:val="18"/>
-        </w:numPr>
-      </w:pPr>
-      <w:r>
-        <w:t>Pytest test suite</w:t>
-      </w:r>
-    </w:p>
-    <w:p>
-      <w:pPr>
-        <w:pStyle w:val="ListBullet"/>
-        <w:numPr>
-          <w:ilvl w:val="0"/>
-          <w:numId w:val="18"/>
-        </w:numPr>
-      </w:pPr>
-      <w:r>
-        <w:t>Dockerfile and GitHub Actions YAML</w:t>
-      </w:r>
-    </w:p>
-    <w:p>
-      <w:pPr>
-        <w:pStyle w:val="ListBullet"/>
-        <w:numPr>
-          <w:ilvl w:val="0"/>
-          <w:numId w:val="18"/>
-        </w:numPr>
-      </w:pPr>
-      <w:r>
-        <w:t>README.md with setup, tests, CI/CD overview</w:t>
       </w:r>
     </w:p>
     <w:sectPr>
@@ -3023,6 +2962,7 @@
   <w:style w:type="character" w:default="1" w:styleId="DefaultParagraphFont">
     <w:name w:val="Default Paragraph Font"/>
     <w:uiPriority w:val="1"/>
+    <w:semiHidden/>
     <w:unhideWhenUsed/>
   </w:style>
   <w:style w:type="table" w:default="1" w:styleId="TableNormal">

</xml_diff>

<commit_message>
Updated documents and screenshots
</commit_message>
<xml_diff>
--- a/ACEest_Assignment1_Deliverables.docx
+++ b/ACEest_Assignment1_Deliverables.docx
@@ -112,6 +112,9 @@
       </w:r>
     </w:p>
     <w:p>
+      <w:pPr>
+        <w:ind w:firstLine="360"/>
+      </w:pPr>
       <w:r>
         <w:rPr>
           <w:b/>
@@ -129,6 +132,142 @@
     </w:p>
     <w:p>
       <w:pPr>
+        <w:pStyle w:val="ListBullet"/>
+        <w:numPr>
+          <w:ilvl w:val="0"/>
+          <w:numId w:val="0"/>
+        </w:numPr>
+        <w:ind w:left="360" w:hanging="360"/>
+        <w:rPr>
+          <w:b/>
+          <w:bCs/>
+          <w:color w:val="EE0000"/>
+        </w:rPr>
+      </w:pPr>
+      <w:r>
+        <w:rPr>
+          <w:b/>
+          <w:bCs/>
+          <w:color w:val="EE0000"/>
+        </w:rPr>
+        <w:t>Please note that in Virtual machine, I have added</w:t>
+      </w:r>
+      <w:r>
+        <w:rPr>
+          <w:b/>
+          <w:bCs/>
+          <w:color w:val="EE0000"/>
+        </w:rPr>
+        <w:t xml:space="preserve"> my application</w:t>
+      </w:r>
+      <w:r>
+        <w:rPr>
+          <w:b/>
+          <w:bCs/>
+          <w:color w:val="EE0000"/>
+        </w:rPr>
+        <w:t xml:space="preserve"> in “workspace/Assignment1/</w:t>
+      </w:r>
+      <w:r>
+        <w:rPr>
+          <w:b/>
+          <w:bCs/>
+        </w:rPr>
+        <w:t xml:space="preserve"> </w:t>
+      </w:r>
+      <w:proofErr w:type="spellStart"/>
+      <w:r>
+        <w:rPr>
+          <w:b/>
+          <w:bCs/>
+          <w:color w:val="EE0000"/>
+        </w:rPr>
+        <w:t>aceest</w:t>
+      </w:r>
+      <w:proofErr w:type="spellEnd"/>
+      <w:r>
+        <w:rPr>
+          <w:b/>
+          <w:bCs/>
+          <w:color w:val="EE0000"/>
+        </w:rPr>
+        <w:t xml:space="preserve">-fitness” folder. </w:t>
+      </w:r>
+    </w:p>
+    <w:p>
+      <w:pPr>
+        <w:pStyle w:val="ListBullet"/>
+        <w:numPr>
+          <w:ilvl w:val="0"/>
+          <w:numId w:val="0"/>
+        </w:numPr>
+        <w:ind w:left="360" w:hanging="360"/>
+        <w:rPr>
+          <w:b/>
+          <w:bCs/>
+          <w:color w:val="EE0000"/>
+        </w:rPr>
+      </w:pPr>
+    </w:p>
+    <w:p>
+      <w:pPr>
+        <w:pStyle w:val="ListBullet"/>
+        <w:numPr>
+          <w:ilvl w:val="0"/>
+          <w:numId w:val="0"/>
+        </w:numPr>
+        <w:ind w:left="360" w:hanging="360"/>
+        <w:rPr>
+          <w:b/>
+          <w:bCs/>
+          <w:color w:val="EE0000"/>
+        </w:rPr>
+      </w:pPr>
+      <w:r>
+        <w:rPr>
+          <w:b/>
+          <w:bCs/>
+          <w:color w:val="EE0000"/>
+        </w:rPr>
+        <w:drawing>
+          <wp:inline distT="0" distB="0" distL="0" distR="0" wp14:anchorId="50F09158" wp14:editId="21032874">
+            <wp:extent cx="5486400" cy="2796540"/>
+            <wp:effectExtent l="0" t="0" r="0" b="3810"/>
+            <wp:docPr id="425404401" name="Picture 1"/>
+            <wp:cNvGraphicFramePr>
+              <a:graphicFrameLocks xmlns:a="http://schemas.openxmlformats.org/drawingml/2006/main" noChangeAspect="1"/>
+            </wp:cNvGraphicFramePr>
+            <a:graphic xmlns:a="http://schemas.openxmlformats.org/drawingml/2006/main">
+              <a:graphicData uri="http://schemas.openxmlformats.org/drawingml/2006/picture">
+                <pic:pic xmlns:pic="http://schemas.openxmlformats.org/drawingml/2006/picture">
+                  <pic:nvPicPr>
+                    <pic:cNvPr id="425404401" name=""/>
+                    <pic:cNvPicPr/>
+                  </pic:nvPicPr>
+                  <pic:blipFill>
+                    <a:blip r:embed="rId7"/>
+                    <a:stretch>
+                      <a:fillRect/>
+                    </a:stretch>
+                  </pic:blipFill>
+                  <pic:spPr>
+                    <a:xfrm>
+                      <a:off x="0" y="0"/>
+                      <a:ext cx="5486400" cy="2796540"/>
+                    </a:xfrm>
+                    <a:prstGeom prst="rect">
+                      <a:avLst/>
+                    </a:prstGeom>
+                  </pic:spPr>
+                </pic:pic>
+              </a:graphicData>
+            </a:graphic>
+          </wp:inline>
+        </w:drawing>
+      </w:r>
+    </w:p>
+    <w:p>
+      <w:pPr>
         <w:pStyle w:val="Heading1"/>
       </w:pPr>
       <w:r>
@@ -149,6 +288,7 @@
         </w:numPr>
       </w:pPr>
       <w:r>
+        <w:lastRenderedPageBreak/>
         <w:t>app.py — Flask REST API (health, metrics, programs, calories, clients).</w:t>
       </w:r>
     </w:p>
@@ -161,7 +301,7 @@
         </w:numPr>
         <w:ind w:left="360" w:firstLine="360"/>
       </w:pPr>
-      <w:hyperlink r:id="rId7" w:history="1">
+      <w:hyperlink r:id="rId8" w:history="1">
         <w:r>
           <w:rPr>
             <w:rStyle w:val="Hyperlink"/>
@@ -209,7 +349,7 @@
         </w:numPr>
         <w:ind w:left="408" w:firstLine="312"/>
       </w:pPr>
-      <w:hyperlink r:id="rId8" w:history="1">
+      <w:hyperlink r:id="rId9" w:history="1">
         <w:r>
           <w:rPr>
             <w:rStyle w:val="Hyperlink"/>
@@ -249,7 +389,7 @@
         </w:numPr>
         <w:ind w:left="408" w:firstLine="312"/>
       </w:pPr>
-      <w:hyperlink r:id="rId9" w:history="1">
+      <w:hyperlink r:id="rId10" w:history="1">
         <w:r>
           <w:rPr>
             <w:rStyle w:val="Hyperlink"/>
@@ -289,7 +429,7 @@
         </w:numPr>
         <w:ind w:left="408" w:firstLine="312"/>
       </w:pPr>
-      <w:hyperlink r:id="rId10" w:history="1">
+      <w:hyperlink r:id="rId11" w:history="1">
         <w:r>
           <w:rPr>
             <w:rStyle w:val="Hyperlink"/>
@@ -322,7 +462,7 @@
       <w:r>
         <w:br/>
       </w:r>
-      <w:hyperlink r:id="rId11" w:history="1">
+      <w:hyperlink r:id="rId12" w:history="1">
         <w:r>
           <w:rPr>
             <w:rStyle w:val="Hyperlink"/>
@@ -353,34 +493,817 @@
           <w:color w:val="EE0000"/>
         </w:rPr>
       </w:pPr>
+    </w:p>
+    <w:p>
+      <w:pPr>
+        <w:pStyle w:val="ListBullet"/>
+        <w:numPr>
+          <w:ilvl w:val="0"/>
+          <w:numId w:val="0"/>
+        </w:numPr>
+        <w:ind w:left="360" w:hanging="360"/>
+        <w:rPr>
+          <w:color w:val="EE0000"/>
+        </w:rPr>
+      </w:pPr>
       <w:r>
         <w:rPr>
           <w:color w:val="EE0000"/>
         </w:rPr>
-        <w:t xml:space="preserve">Action: Need to add a screenshot of </w:t>
+        <w:drawing>
+          <wp:inline distT="0" distB="0" distL="0" distR="0" wp14:anchorId="1DC01649" wp14:editId="7FB3FCC0">
+            <wp:extent cx="5486400" cy="1895475"/>
+            <wp:effectExtent l="0" t="0" r="0" b="9525"/>
+            <wp:docPr id="100881789" name="Picture 1"/>
+            <wp:cNvGraphicFramePr>
+              <a:graphicFrameLocks xmlns:a="http://schemas.openxmlformats.org/drawingml/2006/main" noChangeAspect="1"/>
+            </wp:cNvGraphicFramePr>
+            <a:graphic xmlns:a="http://schemas.openxmlformats.org/drawingml/2006/main">
+              <a:graphicData uri="http://schemas.openxmlformats.org/drawingml/2006/picture">
+                <pic:pic xmlns:pic="http://schemas.openxmlformats.org/drawingml/2006/picture">
+                  <pic:nvPicPr>
+                    <pic:cNvPr id="100881789" name=""/>
+                    <pic:cNvPicPr/>
+                  </pic:nvPicPr>
+                  <pic:blipFill>
+                    <a:blip r:embed="rId13"/>
+                    <a:stretch>
+                      <a:fillRect/>
+                    </a:stretch>
+                  </pic:blipFill>
+                  <pic:spPr>
+                    <a:xfrm>
+                      <a:off x="0" y="0"/>
+                      <a:ext cx="5486400" cy="1895475"/>
+                    </a:xfrm>
+                    <a:prstGeom prst="rect">
+                      <a:avLst/>
+                    </a:prstGeom>
+                  </pic:spPr>
+                </pic:pic>
+              </a:graphicData>
+            </a:graphic>
+          </wp:inline>
+        </w:drawing>
+      </w:r>
+    </w:p>
+    <w:p>
+      <w:pPr>
+        <w:pStyle w:val="ListBullet"/>
+        <w:numPr>
+          <w:ilvl w:val="0"/>
+          <w:numId w:val="0"/>
+        </w:numPr>
+        <w:ind w:left="360" w:hanging="360"/>
+        <w:rPr>
+          <w:color w:val="EE0000"/>
+        </w:rPr>
+      </w:pPr>
+      <w:r>
+        <w:rPr>
+          <w:color w:val="EE0000"/>
+        </w:rPr>
+        <w:drawing>
+          <wp:inline distT="0" distB="0" distL="0" distR="0" wp14:anchorId="07173E38" wp14:editId="21C057DF">
+            <wp:extent cx="5486400" cy="2796540"/>
+            <wp:effectExtent l="0" t="0" r="0" b="3810"/>
+            <wp:docPr id="592815206" name="Picture 1"/>
+            <wp:cNvGraphicFramePr>
+              <a:graphicFrameLocks xmlns:a="http://schemas.openxmlformats.org/drawingml/2006/main" noChangeAspect="1"/>
+            </wp:cNvGraphicFramePr>
+            <a:graphic xmlns:a="http://schemas.openxmlformats.org/drawingml/2006/main">
+              <a:graphicData uri="http://schemas.openxmlformats.org/drawingml/2006/picture">
+                <pic:pic xmlns:pic="http://schemas.openxmlformats.org/drawingml/2006/picture">
+                  <pic:nvPicPr>
+                    <pic:cNvPr id="592815206" name=""/>
+                    <pic:cNvPicPr/>
+                  </pic:nvPicPr>
+                  <pic:blipFill>
+                    <a:blip r:embed="rId7"/>
+                    <a:stretch>
+                      <a:fillRect/>
+                    </a:stretch>
+                  </pic:blipFill>
+                  <pic:spPr>
+                    <a:xfrm>
+                      <a:off x="0" y="0"/>
+                      <a:ext cx="5486400" cy="2796540"/>
+                    </a:xfrm>
+                    <a:prstGeom prst="rect">
+                      <a:avLst/>
+                    </a:prstGeom>
+                  </pic:spPr>
+                </pic:pic>
+              </a:graphicData>
+            </a:graphic>
+          </wp:inline>
+        </w:drawing>
+      </w:r>
+    </w:p>
+    <w:p>
+      <w:pPr>
+        <w:pStyle w:val="ListBullet"/>
+        <w:numPr>
+          <w:ilvl w:val="0"/>
+          <w:numId w:val="0"/>
+        </w:numPr>
+        <w:ind w:left="360" w:hanging="360"/>
+        <w:rPr>
+          <w:color w:val="EE0000"/>
+        </w:rPr>
+      </w:pPr>
+    </w:p>
+    <w:p>
+      <w:pPr>
+        <w:pStyle w:val="ListBullet"/>
+        <w:numPr>
+          <w:ilvl w:val="0"/>
+          <w:numId w:val="0"/>
+        </w:numPr>
+        <w:ind w:left="360" w:hanging="360"/>
+        <w:rPr>
+          <w:color w:val="EE0000"/>
+        </w:rPr>
+      </w:pPr>
+    </w:p>
+    <w:p>
+      <w:pPr>
+        <w:pStyle w:val="Heading1"/>
+      </w:pPr>
+      <w:r>
+        <w:lastRenderedPageBreak/>
+        <w:t xml:space="preserve">4. </w:t>
+      </w:r>
+      <w:r>
+        <w:t>Application Run</w:t>
+      </w:r>
+    </w:p>
+    <w:p>
+      <w:pPr>
+        <w:pStyle w:val="Heading2"/>
+        <w:ind w:firstLine="720"/>
+      </w:pPr>
+      <w:r>
+        <w:t xml:space="preserve"> </w:t>
+      </w:r>
+      <w:r>
+        <w:t>A.</w:t>
+      </w:r>
+      <w:r>
+        <w:t xml:space="preserve"> First cloned the repository using </w:t>
+      </w:r>
+      <w:r>
+        <w:t>the</w:t>
+      </w:r>
+      <w:r>
+        <w:t xml:space="preserve"> git command</w:t>
+      </w:r>
+    </w:p>
+    <w:p>
+      <w:pPr>
+        <w:pStyle w:val="Heading2"/>
+        <w:ind w:firstLine="720"/>
+        <w:rPr>
+          <w:rFonts w:ascii="Segoe UI" w:hAnsi="Segoe UI" w:cs="Segoe UI"/>
+          <w:b w:val="0"/>
+          <w:bCs w:val="0"/>
+          <w:color w:val="000000"/>
+          <w:sz w:val="28"/>
+          <w:szCs w:val="28"/>
+          <w:lang w:val="en-IN"/>
+        </w:rPr>
+      </w:pPr>
+      <w:r>
+        <w:rPr>
+          <w:rFonts w:ascii="Segoe UI" w:hAnsi="Segoe UI" w:cs="Segoe UI"/>
+          <w:b w:val="0"/>
+          <w:bCs w:val="0"/>
+          <w:color w:val="000000"/>
+          <w:sz w:val="20"/>
+          <w:szCs w:val="20"/>
+        </w:rPr>
+        <w:t xml:space="preserve"> </w:t>
+      </w:r>
+      <w:r>
+        <w:rPr>
+          <w:rFonts w:ascii="Segoe UI" w:hAnsi="Segoe UI" w:cs="Segoe UI"/>
+          <w:b w:val="0"/>
+          <w:bCs w:val="0"/>
+          <w:color w:val="000000"/>
+          <w:lang w:val="en-IN"/>
+        </w:rPr>
+        <w:t>git clone https://github.com/2025tm93239/aceest-fitness</w:t>
+      </w:r>
+    </w:p>
+    <w:p>
+      <w:pPr>
+        <w:pStyle w:val="Heading2"/>
+        <w:ind w:firstLine="720"/>
+      </w:pPr>
+      <w:r>
+        <w:t xml:space="preserve">B. </w:t>
+      </w:r>
+      <w:r>
+        <w:t xml:space="preserve"> </w:t>
+      </w:r>
+      <w:r>
+        <w:t>Create a virtual environment and install dependencies</w:t>
+      </w:r>
+      <w:r>
+        <w:t xml:space="preserve"> </w:t>
+      </w:r>
+    </w:p>
+    <w:p>
+      <w:pPr>
+        <w:rPr>
+          <w:lang w:val="en-IN"/>
+        </w:rPr>
+      </w:pPr>
+      <w:r>
+        <w:tab/>
+      </w:r>
+      <w:r>
+        <w:tab/>
+      </w:r>
+      <w:r>
+        <w:rPr>
+          <w:lang w:val="en-IN"/>
+        </w:rPr>
+        <w:t xml:space="preserve">python3 -m </w:t>
       </w:r>
       <w:proofErr w:type="spellStart"/>
       <w:r>
         <w:rPr>
-          <w:color w:val="EE0000"/>
+          <w:lang w:val="en-IN"/>
         </w:rPr>
-        <w:t>Git</w:t>
+        <w:t>venv</w:t>
       </w:r>
       <w:proofErr w:type="spellEnd"/>
       <w:r>
         <w:rPr>
-          <w:color w:val="EE0000"/>
+          <w:lang w:val="en-IN"/>
         </w:rPr>
-        <w:t xml:space="preserve"> Repo</w:t>
+        <w:t xml:space="preserve"> .</w:t>
+      </w:r>
+      <w:proofErr w:type="spellStart"/>
+      <w:r>
+        <w:rPr>
+          <w:lang w:val="en-IN"/>
+        </w:rPr>
+        <w:t>venv</w:t>
+      </w:r>
+      <w:proofErr w:type="spellEnd"/>
+    </w:p>
+    <w:p>
+      <w:pPr>
+        <w:ind w:left="720" w:firstLine="720"/>
+        <w:rPr>
+          <w:lang w:val="en-IN"/>
+        </w:rPr>
+      </w:pPr>
+      <w:r>
+        <w:rPr>
+          <w:lang w:val="en-IN"/>
+        </w:rPr>
+        <w:t>source .</w:t>
+      </w:r>
+      <w:proofErr w:type="spellStart"/>
+      <w:r>
+        <w:rPr>
+          <w:lang w:val="en-IN"/>
+        </w:rPr>
+        <w:t>venv</w:t>
+      </w:r>
+      <w:proofErr w:type="spellEnd"/>
+      <w:r>
+        <w:rPr>
+          <w:lang w:val="en-IN"/>
+        </w:rPr>
+        <w:t>/bin/activate</w:t>
       </w:r>
     </w:p>
     <w:p>
       <w:pPr>
+        <w:ind w:left="720" w:firstLine="720"/>
+        <w:rPr>
+          <w:lang w:val="en-IN"/>
+        </w:rPr>
+      </w:pPr>
+      <w:r>
+        <w:rPr>
+          <w:lang w:val="en-IN"/>
+        </w:rPr>
+        <w:t>pip install -r requirements.txt</w:t>
+      </w:r>
+      <w:r>
+        <w:tab/>
+      </w:r>
+    </w:p>
+    <w:p>
+      <w:r>
+        <w:drawing>
+          <wp:inline distT="0" distB="0" distL="0" distR="0" wp14:anchorId="641F40B8" wp14:editId="7394DD3B">
+            <wp:extent cx="5486400" cy="2799080"/>
+            <wp:effectExtent l="0" t="0" r="0" b="1270"/>
+            <wp:docPr id="601669604" name="Picture 1"/>
+            <wp:cNvGraphicFramePr>
+              <a:graphicFrameLocks xmlns:a="http://schemas.openxmlformats.org/drawingml/2006/main" noChangeAspect="1"/>
+            </wp:cNvGraphicFramePr>
+            <a:graphic xmlns:a="http://schemas.openxmlformats.org/drawingml/2006/main">
+              <a:graphicData uri="http://schemas.openxmlformats.org/drawingml/2006/picture">
+                <pic:pic xmlns:pic="http://schemas.openxmlformats.org/drawingml/2006/picture">
+                  <pic:nvPicPr>
+                    <pic:cNvPr id="601669604" name=""/>
+                    <pic:cNvPicPr/>
+                  </pic:nvPicPr>
+                  <pic:blipFill>
+                    <a:blip r:embed="rId14"/>
+                    <a:stretch>
+                      <a:fillRect/>
+                    </a:stretch>
+                  </pic:blipFill>
+                  <pic:spPr>
+                    <a:xfrm>
+                      <a:off x="0" y="0"/>
+                      <a:ext cx="5486400" cy="2799080"/>
+                    </a:xfrm>
+                    <a:prstGeom prst="rect">
+                      <a:avLst/>
+                    </a:prstGeom>
+                  </pic:spPr>
+                </pic:pic>
+              </a:graphicData>
+            </a:graphic>
+          </wp:inline>
+        </w:drawing>
+      </w:r>
+    </w:p>
+    <w:p/>
+    <w:p>
+      <w:pPr>
+        <w:pStyle w:val="Heading2"/>
+      </w:pPr>
+      <w:r>
+        <w:tab/>
+      </w:r>
+      <w:r>
+        <w:t xml:space="preserve">C. Now, ran the application server. </w:t>
+      </w:r>
+    </w:p>
+    <w:p>
+      <w:pPr>
+        <w:ind w:left="720" w:firstLine="720"/>
+        <w:rPr>
+          <w:lang w:val="en-IN"/>
+        </w:rPr>
+      </w:pPr>
+      <w:r>
+        <w:rPr>
+          <w:lang w:val="en-IN"/>
+        </w:rPr>
+        <w:t>python app.py</w:t>
+      </w:r>
+    </w:p>
+    <w:p>
+      <w:pPr>
+        <w:pStyle w:val="ListBullet"/>
+        <w:numPr>
+          <w:ilvl w:val="0"/>
+          <w:numId w:val="0"/>
+        </w:numPr>
+        <w:rPr>
+          <w:color w:val="EE0000"/>
+        </w:rPr>
+      </w:pPr>
+      <w:r>
+        <w:rPr>
+          <w:color w:val="EE0000"/>
+        </w:rPr>
+        <w:drawing>
+          <wp:inline distT="0" distB="0" distL="0" distR="0" wp14:anchorId="1DC6D405" wp14:editId="0316BD38">
+            <wp:extent cx="5486400" cy="775970"/>
+            <wp:effectExtent l="0" t="0" r="0" b="5080"/>
+            <wp:docPr id="581087346" name="Picture 1"/>
+            <wp:cNvGraphicFramePr>
+              <a:graphicFrameLocks xmlns:a="http://schemas.openxmlformats.org/drawingml/2006/main" noChangeAspect="1"/>
+            </wp:cNvGraphicFramePr>
+            <a:graphic xmlns:a="http://schemas.openxmlformats.org/drawingml/2006/main">
+              <a:graphicData uri="http://schemas.openxmlformats.org/drawingml/2006/picture">
+                <pic:pic xmlns:pic="http://schemas.openxmlformats.org/drawingml/2006/picture">
+                  <pic:nvPicPr>
+                    <pic:cNvPr id="581087346" name=""/>
+                    <pic:cNvPicPr/>
+                  </pic:nvPicPr>
+                  <pic:blipFill>
+                    <a:blip r:embed="rId15"/>
+                    <a:stretch>
+                      <a:fillRect/>
+                    </a:stretch>
+                  </pic:blipFill>
+                  <pic:spPr>
+                    <a:xfrm>
+                      <a:off x="0" y="0"/>
+                      <a:ext cx="5486400" cy="775970"/>
+                    </a:xfrm>
+                    <a:prstGeom prst="rect">
+                      <a:avLst/>
+                    </a:prstGeom>
+                  </pic:spPr>
+                </pic:pic>
+              </a:graphicData>
+            </a:graphic>
+          </wp:inline>
+        </w:drawing>
+      </w:r>
+    </w:p>
+    <w:p>
+      <w:pPr>
+        <w:pStyle w:val="ListBullet"/>
+        <w:numPr>
+          <w:ilvl w:val="0"/>
+          <w:numId w:val="0"/>
+        </w:numPr>
+        <w:rPr>
+          <w:color w:val="EE0000"/>
+        </w:rPr>
+      </w:pPr>
+    </w:p>
+    <w:p>
+      <w:pPr>
+        <w:pStyle w:val="ListBullet"/>
+        <w:numPr>
+          <w:ilvl w:val="0"/>
+          <w:numId w:val="0"/>
+        </w:numPr>
+        <w:ind w:left="360" w:hanging="360"/>
+        <w:rPr>
+          <w:color w:val="EE0000"/>
+        </w:rPr>
+      </w:pPr>
+    </w:p>
+    <w:p>
+      <w:pPr>
+        <w:pStyle w:val="ListBullet"/>
+        <w:numPr>
+          <w:ilvl w:val="0"/>
+          <w:numId w:val="0"/>
+        </w:numPr>
+        <w:ind w:left="360" w:hanging="360"/>
+        <w:rPr>
+          <w:color w:val="EE0000"/>
+        </w:rPr>
+      </w:pPr>
+      <w:r>
+        <w:rPr>
+          <w:color w:val="EE0000"/>
+        </w:rPr>
+        <w:t xml:space="preserve">Our application is running on URLs below. </w:t>
+      </w:r>
+    </w:p>
+    <w:p>
+      <w:pPr>
+        <w:pStyle w:val="ListBullet"/>
+        <w:numPr>
+          <w:ilvl w:val="0"/>
+          <w:numId w:val="0"/>
+        </w:numPr>
+        <w:ind w:left="360" w:hanging="360"/>
+        <w:rPr>
+          <w:color w:val="EE0000"/>
+        </w:rPr>
+      </w:pPr>
+    </w:p>
+    <w:p>
+      <w:pPr>
+        <w:pStyle w:val="ListBullet"/>
+        <w:numPr>
+          <w:ilvl w:val="0"/>
+          <w:numId w:val="0"/>
+        </w:numPr>
+        <w:ind w:left="360" w:hanging="360"/>
+        <w:rPr>
+          <w:color w:val="EE0000"/>
+        </w:rPr>
+      </w:pPr>
+      <w:r>
+        <w:rPr>
+          <w:color w:val="EE0000"/>
+        </w:rPr>
+        <w:t>* Running on http://127.0.0.1:5000</w:t>
+      </w:r>
+    </w:p>
+    <w:p>
+      <w:pPr>
+        <w:pStyle w:val="ListBullet"/>
+        <w:numPr>
+          <w:ilvl w:val="0"/>
+          <w:numId w:val="0"/>
+        </w:numPr>
+        <w:rPr>
+          <w:color w:val="EE0000"/>
+        </w:rPr>
+      </w:pPr>
+      <w:r>
+        <w:rPr>
+          <w:color w:val="EE0000"/>
+        </w:rPr>
+        <w:t xml:space="preserve"> * Running on http://10.3.18.45:5000</w:t>
+      </w:r>
+    </w:p>
+    <w:p>
+      <w:pPr>
+        <w:pStyle w:val="ListBullet"/>
+        <w:numPr>
+          <w:ilvl w:val="0"/>
+          <w:numId w:val="0"/>
+        </w:numPr>
+        <w:rPr>
+          <w:color w:val="EE0000"/>
+        </w:rPr>
+      </w:pPr>
+    </w:p>
+    <w:p>
+      <w:pPr>
+        <w:pStyle w:val="ListBullet"/>
+        <w:numPr>
+          <w:ilvl w:val="0"/>
+          <w:numId w:val="0"/>
+        </w:numPr>
+        <w:rPr>
+          <w:color w:val="EE0000"/>
+        </w:rPr>
+      </w:pPr>
+      <w:r>
+        <w:rPr>
+          <w:color w:val="EE0000"/>
+        </w:rPr>
+        <w:lastRenderedPageBreak/>
+        <w:drawing>
+          <wp:inline distT="0" distB="0" distL="0" distR="0" wp14:anchorId="6B675C55" wp14:editId="043CE582">
+            <wp:extent cx="5486400" cy="852805"/>
+            <wp:effectExtent l="0" t="0" r="0" b="4445"/>
+            <wp:docPr id="638430073" name="Picture 1"/>
+            <wp:cNvGraphicFramePr>
+              <a:graphicFrameLocks xmlns:a="http://schemas.openxmlformats.org/drawingml/2006/main" noChangeAspect="1"/>
+            </wp:cNvGraphicFramePr>
+            <a:graphic xmlns:a="http://schemas.openxmlformats.org/drawingml/2006/main">
+              <a:graphicData uri="http://schemas.openxmlformats.org/drawingml/2006/picture">
+                <pic:pic xmlns:pic="http://schemas.openxmlformats.org/drawingml/2006/picture">
+                  <pic:nvPicPr>
+                    <pic:cNvPr id="638430073" name=""/>
+                    <pic:cNvPicPr/>
+                  </pic:nvPicPr>
+                  <pic:blipFill>
+                    <a:blip r:embed="rId16"/>
+                    <a:stretch>
+                      <a:fillRect/>
+                    </a:stretch>
+                  </pic:blipFill>
+                  <pic:spPr>
+                    <a:xfrm>
+                      <a:off x="0" y="0"/>
+                      <a:ext cx="5486400" cy="852805"/>
+                    </a:xfrm>
+                    <a:prstGeom prst="rect">
+                      <a:avLst/>
+                    </a:prstGeom>
+                  </pic:spPr>
+                </pic:pic>
+              </a:graphicData>
+            </a:graphic>
+          </wp:inline>
+        </w:drawing>
+      </w:r>
+    </w:p>
+    <w:p>
+      <w:pPr>
+        <w:pStyle w:val="ListBullet"/>
+        <w:numPr>
+          <w:ilvl w:val="0"/>
+          <w:numId w:val="0"/>
+        </w:numPr>
+        <w:rPr>
+          <w:color w:val="EE0000"/>
+        </w:rPr>
+      </w:pPr>
+    </w:p>
+    <w:p>
+      <w:pPr>
+        <w:pStyle w:val="ListBullet"/>
+        <w:numPr>
+          <w:ilvl w:val="0"/>
+          <w:numId w:val="0"/>
+        </w:numPr>
+        <w:rPr>
+          <w:color w:val="EE0000"/>
+        </w:rPr>
+      </w:pPr>
+      <w:hyperlink r:id="rId17" w:history="1">
+        <w:r>
+          <w:rPr>
+            <w:rStyle w:val="Hyperlink"/>
+          </w:rPr>
+          <w:t>http://127.0.0.1:5000/metrics</w:t>
+        </w:r>
+      </w:hyperlink>
+    </w:p>
+    <w:p>
+      <w:pPr>
+        <w:pStyle w:val="ListBullet"/>
+        <w:numPr>
+          <w:ilvl w:val="0"/>
+          <w:numId w:val="0"/>
+        </w:numPr>
+        <w:rPr>
+          <w:color w:val="EE0000"/>
+        </w:rPr>
+      </w:pPr>
+    </w:p>
+    <w:p>
+      <w:pPr>
+        <w:pStyle w:val="ListBullet"/>
+        <w:numPr>
+          <w:ilvl w:val="0"/>
+          <w:numId w:val="0"/>
+        </w:numPr>
+        <w:rPr>
+          <w:color w:val="EE0000"/>
+        </w:rPr>
+      </w:pPr>
+      <w:r>
+        <w:rPr>
+          <w:color w:val="EE0000"/>
+        </w:rPr>
+        <w:drawing>
+          <wp:inline distT="0" distB="0" distL="0" distR="0" wp14:anchorId="083B0612" wp14:editId="7E4DC6B0">
+            <wp:extent cx="5486400" cy="952500"/>
+            <wp:effectExtent l="0" t="0" r="0" b="0"/>
+            <wp:docPr id="892156703" name="Picture 1"/>
+            <wp:cNvGraphicFramePr>
+              <a:graphicFrameLocks xmlns:a="http://schemas.openxmlformats.org/drawingml/2006/main" noChangeAspect="1"/>
+            </wp:cNvGraphicFramePr>
+            <a:graphic xmlns:a="http://schemas.openxmlformats.org/drawingml/2006/main">
+              <a:graphicData uri="http://schemas.openxmlformats.org/drawingml/2006/picture">
+                <pic:pic xmlns:pic="http://schemas.openxmlformats.org/drawingml/2006/picture">
+                  <pic:nvPicPr>
+                    <pic:cNvPr id="892156703" name=""/>
+                    <pic:cNvPicPr/>
+                  </pic:nvPicPr>
+                  <pic:blipFill>
+                    <a:blip r:embed="rId18"/>
+                    <a:stretch>
+                      <a:fillRect/>
+                    </a:stretch>
+                  </pic:blipFill>
+                  <pic:spPr>
+                    <a:xfrm>
+                      <a:off x="0" y="0"/>
+                      <a:ext cx="5486400" cy="952500"/>
+                    </a:xfrm>
+                    <a:prstGeom prst="rect">
+                      <a:avLst/>
+                    </a:prstGeom>
+                  </pic:spPr>
+                </pic:pic>
+              </a:graphicData>
+            </a:graphic>
+          </wp:inline>
+        </w:drawing>
+      </w:r>
+    </w:p>
+    <w:p>
+      <w:pPr>
+        <w:pStyle w:val="ListBullet"/>
+        <w:numPr>
+          <w:ilvl w:val="0"/>
+          <w:numId w:val="0"/>
+        </w:numPr>
+        <w:rPr>
+          <w:color w:val="EE0000"/>
+        </w:rPr>
+      </w:pPr>
+    </w:p>
+    <w:p>
+      <w:pPr>
+        <w:pStyle w:val="ListBullet"/>
+        <w:numPr>
+          <w:ilvl w:val="0"/>
+          <w:numId w:val="0"/>
+        </w:numPr>
+        <w:rPr>
+          <w:color w:val="0070C0"/>
+        </w:rPr>
+      </w:pPr>
+      <w:r>
+        <w:rPr>
+          <w:color w:val="0070C0"/>
+        </w:rPr>
+        <w:t>http://127.0.0.1:5000//programs</w:t>
+      </w:r>
+    </w:p>
+    <w:p>
+      <w:pPr>
+        <w:pStyle w:val="ListBullet"/>
+        <w:numPr>
+          <w:ilvl w:val="0"/>
+          <w:numId w:val="0"/>
+        </w:numPr>
+        <w:rPr>
+          <w:color w:val="EE0000"/>
+        </w:rPr>
+      </w:pPr>
+    </w:p>
+    <w:p>
+      <w:pPr>
+        <w:pStyle w:val="ListBullet"/>
+        <w:numPr>
+          <w:ilvl w:val="0"/>
+          <w:numId w:val="0"/>
+        </w:numPr>
+        <w:rPr>
+          <w:color w:val="EE0000"/>
+        </w:rPr>
+      </w:pPr>
+      <w:r>
+        <w:rPr>
+          <w:color w:val="EE0000"/>
+        </w:rPr>
+        <w:drawing>
+          <wp:inline distT="0" distB="0" distL="0" distR="0" wp14:anchorId="26AC71AE" wp14:editId="7A58896B">
+            <wp:extent cx="5486400" cy="867410"/>
+            <wp:effectExtent l="0" t="0" r="0" b="8890"/>
+            <wp:docPr id="2002300154" name="Picture 1"/>
+            <wp:cNvGraphicFramePr>
+              <a:graphicFrameLocks xmlns:a="http://schemas.openxmlformats.org/drawingml/2006/main" noChangeAspect="1"/>
+            </wp:cNvGraphicFramePr>
+            <a:graphic xmlns:a="http://schemas.openxmlformats.org/drawingml/2006/main">
+              <a:graphicData uri="http://schemas.openxmlformats.org/drawingml/2006/picture">
+                <pic:pic xmlns:pic="http://schemas.openxmlformats.org/drawingml/2006/picture">
+                  <pic:nvPicPr>
+                    <pic:cNvPr id="2002300154" name=""/>
+                    <pic:cNvPicPr/>
+                  </pic:nvPicPr>
+                  <pic:blipFill>
+                    <a:blip r:embed="rId19"/>
+                    <a:stretch>
+                      <a:fillRect/>
+                    </a:stretch>
+                  </pic:blipFill>
+                  <pic:spPr>
+                    <a:xfrm>
+                      <a:off x="0" y="0"/>
+                      <a:ext cx="5486400" cy="867410"/>
+                    </a:xfrm>
+                    <a:prstGeom prst="rect">
+                      <a:avLst/>
+                    </a:prstGeom>
+                  </pic:spPr>
+                </pic:pic>
+              </a:graphicData>
+            </a:graphic>
+          </wp:inline>
+        </w:drawing>
+      </w:r>
+    </w:p>
+    <w:p>
+      <w:pPr>
+        <w:pStyle w:val="ListBullet"/>
+        <w:numPr>
+          <w:ilvl w:val="0"/>
+          <w:numId w:val="0"/>
+        </w:numPr>
+        <w:rPr>
+          <w:color w:val="EE0000"/>
+        </w:rPr>
+      </w:pPr>
+    </w:p>
+    <w:p>
+      <w:pPr>
+        <w:pStyle w:val="ListBullet"/>
+        <w:numPr>
+          <w:ilvl w:val="0"/>
+          <w:numId w:val="0"/>
+        </w:numPr>
+        <w:rPr>
+          <w:color w:val="EE0000"/>
+        </w:rPr>
+      </w:pPr>
+      <w:r>
+        <w:rPr>
+          <w:color w:val="EE0000"/>
+        </w:rPr>
+        <w:t xml:space="preserve">I have tested all Endpoints and it is working as expected. </w:t>
+      </w:r>
+    </w:p>
+    <w:p>
+      <w:pPr>
         <w:pStyle w:val="Heading1"/>
       </w:pPr>
       <w:r>
-        <w:lastRenderedPageBreak/>
-        <w:t xml:space="preserve">4. Test Suite — </w:t>
+        <w:t>5</w:t>
+      </w:r>
+      <w:r>
+        <w:t xml:space="preserve">. Test Suite — </w:t>
       </w:r>
       <w:proofErr w:type="spellStart"/>
       <w:r>
@@ -410,7 +1333,7 @@
         </w:numPr>
         <w:ind w:left="720"/>
       </w:pPr>
-      <w:hyperlink r:id="rId12" w:history="1">
+      <w:hyperlink r:id="rId20" w:history="1">
         <w:r>
           <w:rPr>
             <w:rStyle w:val="Hyperlink"/>
@@ -451,7 +1374,7 @@
         </w:numPr>
         <w:ind w:left="720"/>
       </w:pPr>
-      <w:hyperlink r:id="rId13" w:history="1">
+      <w:hyperlink r:id="rId21" w:history="1">
         <w:r>
           <w:rPr>
             <w:rStyle w:val="Hyperlink"/>
@@ -492,7 +1415,7 @@
         </w:numPr>
         <w:ind w:left="720"/>
       </w:pPr>
-      <w:hyperlink r:id="rId14" w:history="1">
+      <w:hyperlink r:id="rId22" w:history="1">
         <w:r>
           <w:rPr>
             <w:rStyle w:val="Hyperlink"/>
@@ -547,7 +1470,7 @@
         </w:numPr>
         <w:ind w:left="720"/>
       </w:pPr>
-      <w:hyperlink r:id="rId15" w:history="1">
+      <w:hyperlink r:id="rId23" w:history="1">
         <w:proofErr w:type="spellStart"/>
         <w:r>
           <w:rPr>
@@ -601,7 +1524,6 @@
         <w:t xml:space="preserve">Eight tests total; run with: </w:t>
       </w:r>
       <w:proofErr w:type="spellStart"/>
-      <w:proofErr w:type="gramStart"/>
       <w:r>
         <w:t>pytest</w:t>
       </w:r>
@@ -609,7 +1531,6 @@
       <w:r>
         <w:t xml:space="preserve"> -v</w:t>
       </w:r>
-      <w:proofErr w:type="gramEnd"/>
     </w:p>
     <w:p>
       <w:pPr>
@@ -629,16 +1550,75 @@
           <w:numId w:val="0"/>
         </w:numPr>
         <w:ind w:left="720"/>
-        <w:rPr>
-          <w:color w:val="EE0000"/>
-        </w:rPr>
       </w:pPr>
       <w:r>
-        <w:rPr>
-          <w:color w:val="EE0000"/>
-        </w:rPr>
-        <w:t>&lt;Add Test Result&gt;</w:t>
+        <w:lastRenderedPageBreak/>
+        <w:drawing>
+          <wp:inline distT="0" distB="0" distL="0" distR="0" wp14:anchorId="65E12C5F" wp14:editId="523C2B2B">
+            <wp:extent cx="5486400" cy="1262380"/>
+            <wp:effectExtent l="0" t="0" r="0" b="0"/>
+            <wp:docPr id="1752398261" name="Picture 1"/>
+            <wp:cNvGraphicFramePr>
+              <a:graphicFrameLocks xmlns:a="http://schemas.openxmlformats.org/drawingml/2006/main" noChangeAspect="1"/>
+            </wp:cNvGraphicFramePr>
+            <a:graphic xmlns:a="http://schemas.openxmlformats.org/drawingml/2006/main">
+              <a:graphicData uri="http://schemas.openxmlformats.org/drawingml/2006/picture">
+                <pic:pic xmlns:pic="http://schemas.openxmlformats.org/drawingml/2006/picture">
+                  <pic:nvPicPr>
+                    <pic:cNvPr id="1752398261" name=""/>
+                    <pic:cNvPicPr/>
+                  </pic:nvPicPr>
+                  <pic:blipFill>
+                    <a:blip r:embed="rId24"/>
+                    <a:stretch>
+                      <a:fillRect/>
+                    </a:stretch>
+                  </pic:blipFill>
+                  <pic:spPr>
+                    <a:xfrm>
+                      <a:off x="0" y="0"/>
+                      <a:ext cx="5486400" cy="1262380"/>
+                    </a:xfrm>
+                    <a:prstGeom prst="rect">
+                      <a:avLst/>
+                    </a:prstGeom>
+                  </pic:spPr>
+                </pic:pic>
+              </a:graphicData>
+            </a:graphic>
+          </wp:inline>
+        </w:drawing>
       </w:r>
+    </w:p>
+    <w:p>
+      <w:pPr>
+        <w:pStyle w:val="ListBullet"/>
+        <w:numPr>
+          <w:ilvl w:val="0"/>
+          <w:numId w:val="0"/>
+        </w:numPr>
+        <w:ind w:left="720"/>
+      </w:pPr>
+    </w:p>
+    <w:p>
+      <w:pPr>
+        <w:pStyle w:val="ListBullet"/>
+        <w:numPr>
+          <w:ilvl w:val="0"/>
+          <w:numId w:val="0"/>
+        </w:numPr>
+        <w:ind w:left="720"/>
+      </w:pPr>
+    </w:p>
+    <w:p>
+      <w:pPr>
+        <w:pStyle w:val="ListBullet"/>
+        <w:numPr>
+          <w:ilvl w:val="0"/>
+          <w:numId w:val="0"/>
+        </w:numPr>
+        <w:ind w:left="720"/>
+      </w:pPr>
     </w:p>
     <w:p>
       <w:pPr>
@@ -676,7 +1656,7 @@
       <w:pPr>
         <w:ind w:left="720"/>
       </w:pPr>
-      <w:hyperlink r:id="rId16" w:history="1">
+      <w:hyperlink r:id="rId25" w:history="1">
         <w:r>
           <w:rPr>
             <w:rStyle w:val="Hyperlink"/>
@@ -723,7 +1703,7 @@
         </w:numPr>
         <w:ind w:left="360"/>
       </w:pPr>
-      <w:hyperlink r:id="rId17" w:history="1">
+      <w:hyperlink r:id="rId26" w:history="1">
         <w:r>
           <w:rPr>
             <w:rStyle w:val="Hyperlink"/>
@@ -884,13 +1864,12 @@
         <w:pStyle w:val="Heading1"/>
       </w:pPr>
       <w:r>
-        <w:lastRenderedPageBreak/>
         <w:t>6. Documentation — README.md</w:t>
       </w:r>
     </w:p>
     <w:p/>
     <w:p>
-      <w:hyperlink r:id="rId18" w:history="1">
+      <w:hyperlink r:id="rId27" w:history="1">
         <w:r>
           <w:rPr>
             <w:rStyle w:val="Hyperlink"/>
@@ -909,6 +1888,7 @@
         </w:numPr>
       </w:pPr>
       <w:r>
+        <w:lastRenderedPageBreak/>
         <w:t>Local setup and execution</w:t>
       </w:r>
     </w:p>
@@ -945,23 +1925,7 @@
         </w:numPr>
       </w:pPr>
       <w:r>
-        <w:t xml:space="preserve">python3 -m </w:t>
-      </w:r>
-      <w:proofErr w:type="gramStart"/>
-      <w:r>
-        <w:t>venv .venv</w:t>
-      </w:r>
-      <w:proofErr w:type="gramEnd"/>
-      <w:r>
-        <w:t xml:space="preserve"> &amp;&amp; </w:t>
-      </w:r>
-      <w:proofErr w:type="gramStart"/>
-      <w:r>
-        <w:t>source .venv</w:t>
-      </w:r>
-      <w:proofErr w:type="gramEnd"/>
-      <w:r>
-        <w:t>/bin/activate</w:t>
+        <w:t>python3 -m venv .venv &amp;&amp; source .venv/bin/activate</w:t>
       </w:r>
     </w:p>
     <w:p>
@@ -1020,7 +1984,6 @@
           <w:numId w:val="20"/>
         </w:numPr>
       </w:pPr>
-      <w:proofErr w:type="gramStart"/>
       <w:r>
         <w:t>source .</w:t>
       </w:r>
@@ -1029,7 +1992,6 @@
         <w:t>venv</w:t>
       </w:r>
       <w:proofErr w:type="spellEnd"/>
-      <w:proofErr w:type="gramEnd"/>
       <w:r>
         <w:t>/bin/activate</w:t>
       </w:r>
@@ -1042,11 +2004,9 @@
           <w:numId w:val="20"/>
         </w:numPr>
       </w:pPr>
-      <w:proofErr w:type="gramStart"/>
       <w:r>
         <w:t>pytest -v</w:t>
       </w:r>
-      <w:proofErr w:type="gramEnd"/>
     </w:p>
     <w:p>
       <w:pPr>
@@ -1828,6 +2788,95 @@
     </w:lvl>
   </w:abstractNum>
   <w:abstractNum w:abstractNumId="15" w15:restartNumberingAfterBreak="0">
+    <w:nsid w:val="3D77409A"/>
+    <w:multiLevelType w:val="hybridMultilevel"/>
+    <w:tmpl w:val="18D066EE"/>
+    <w:lvl w:ilvl="0" w:tplc="40090015">
+      <w:start w:val="1"/>
+      <w:numFmt w:val="upperLetter"/>
+      <w:lvlText w:val="%1."/>
+      <w:lvlJc w:val="left"/>
+      <w:pPr>
+        <w:ind w:left="720" w:hanging="360"/>
+      </w:pPr>
+      <w:rPr>
+        <w:rFonts w:hint="default"/>
+      </w:rPr>
+    </w:lvl>
+    <w:lvl w:ilvl="1" w:tplc="40090019" w:tentative="1">
+      <w:start w:val="1"/>
+      <w:numFmt w:val="lowerLetter"/>
+      <w:lvlText w:val="%2."/>
+      <w:lvlJc w:val="left"/>
+      <w:pPr>
+        <w:ind w:left="1440" w:hanging="360"/>
+      </w:pPr>
+    </w:lvl>
+    <w:lvl w:ilvl="2" w:tplc="4009001B" w:tentative="1">
+      <w:start w:val="1"/>
+      <w:numFmt w:val="lowerRoman"/>
+      <w:lvlText w:val="%3."/>
+      <w:lvlJc w:val="right"/>
+      <w:pPr>
+        <w:ind w:left="2160" w:hanging="180"/>
+      </w:pPr>
+    </w:lvl>
+    <w:lvl w:ilvl="3" w:tplc="4009000F" w:tentative="1">
+      <w:start w:val="1"/>
+      <w:numFmt w:val="decimal"/>
+      <w:lvlText w:val="%4."/>
+      <w:lvlJc w:val="left"/>
+      <w:pPr>
+        <w:ind w:left="2880" w:hanging="360"/>
+      </w:pPr>
+    </w:lvl>
+    <w:lvl w:ilvl="4" w:tplc="40090019" w:tentative="1">
+      <w:start w:val="1"/>
+      <w:numFmt w:val="lowerLetter"/>
+      <w:lvlText w:val="%5."/>
+      <w:lvlJc w:val="left"/>
+      <w:pPr>
+        <w:ind w:left="3600" w:hanging="360"/>
+      </w:pPr>
+    </w:lvl>
+    <w:lvl w:ilvl="5" w:tplc="4009001B" w:tentative="1">
+      <w:start w:val="1"/>
+      <w:numFmt w:val="lowerRoman"/>
+      <w:lvlText w:val="%6."/>
+      <w:lvlJc w:val="right"/>
+      <w:pPr>
+        <w:ind w:left="4320" w:hanging="180"/>
+      </w:pPr>
+    </w:lvl>
+    <w:lvl w:ilvl="6" w:tplc="4009000F" w:tentative="1">
+      <w:start w:val="1"/>
+      <w:numFmt w:val="decimal"/>
+      <w:lvlText w:val="%7."/>
+      <w:lvlJc w:val="left"/>
+      <w:pPr>
+        <w:ind w:left="5040" w:hanging="360"/>
+      </w:pPr>
+    </w:lvl>
+    <w:lvl w:ilvl="7" w:tplc="40090019" w:tentative="1">
+      <w:start w:val="1"/>
+      <w:numFmt w:val="lowerLetter"/>
+      <w:lvlText w:val="%8."/>
+      <w:lvlJc w:val="left"/>
+      <w:pPr>
+        <w:ind w:left="5760" w:hanging="360"/>
+      </w:pPr>
+    </w:lvl>
+    <w:lvl w:ilvl="8" w:tplc="4009001B" w:tentative="1">
+      <w:start w:val="1"/>
+      <w:numFmt w:val="lowerRoman"/>
+      <w:lvlText w:val="%9."/>
+      <w:lvlJc w:val="right"/>
+      <w:pPr>
+        <w:ind w:left="6480" w:hanging="180"/>
+      </w:pPr>
+    </w:lvl>
+  </w:abstractNum>
+  <w:abstractNum w:abstractNumId="16" w15:restartNumberingAfterBreak="0">
     <w:nsid w:val="403B66D6"/>
     <w:multiLevelType w:val="hybridMultilevel"/>
     <w:tmpl w:val="DB306C86"/>
@@ -1916,7 +2965,7 @@
       </w:pPr>
     </w:lvl>
   </w:abstractNum>
-  <w:abstractNum w:abstractNumId="16" w15:restartNumberingAfterBreak="0">
+  <w:abstractNum w:abstractNumId="17" w15:restartNumberingAfterBreak="0">
     <w:nsid w:val="45FB638B"/>
     <w:multiLevelType w:val="hybridMultilevel"/>
     <w:tmpl w:val="31C0E728"/>
@@ -2005,7 +3054,7 @@
       </w:pPr>
     </w:lvl>
   </w:abstractNum>
-  <w:abstractNum w:abstractNumId="17" w15:restartNumberingAfterBreak="0">
+  <w:abstractNum w:abstractNumId="18" w15:restartNumberingAfterBreak="0">
     <w:nsid w:val="5AAA68A8"/>
     <w:multiLevelType w:val="hybridMultilevel"/>
     <w:tmpl w:val="1B1C49FE"/>
@@ -2094,7 +3143,7 @@
       </w:pPr>
     </w:lvl>
   </w:abstractNum>
-  <w:abstractNum w:abstractNumId="18" w15:restartNumberingAfterBreak="0">
+  <w:abstractNum w:abstractNumId="19" w15:restartNumberingAfterBreak="0">
     <w:nsid w:val="70412ACB"/>
     <w:multiLevelType w:val="multilevel"/>
     <w:tmpl w:val="F1FAB0C2"/>
@@ -2207,7 +3256,7 @@
       </w:rPr>
     </w:lvl>
   </w:abstractNum>
-  <w:abstractNum w:abstractNumId="19" w15:restartNumberingAfterBreak="0">
+  <w:abstractNum w:abstractNumId="20" w15:restartNumberingAfterBreak="0">
     <w:nsid w:val="7AC525C8"/>
     <w:multiLevelType w:val="hybridMultilevel"/>
     <w:tmpl w:val="7E20EF74"/>
@@ -2336,10 +3385,10 @@
     <w:abstractNumId w:val="14"/>
   </w:num>
   <w:num w:numId="14" w16cid:durableId="1333946547">
-    <w:abstractNumId w:val="18"/>
+    <w:abstractNumId w:val="19"/>
   </w:num>
   <w:num w:numId="15" w16cid:durableId="944577578">
-    <w:abstractNumId w:val="19"/>
+    <w:abstractNumId w:val="20"/>
   </w:num>
   <w:num w:numId="16" w16cid:durableId="1564490615">
     <w:abstractNumId w:val="12"/>
@@ -2348,13 +3397,16 @@
     <w:abstractNumId w:val="10"/>
   </w:num>
   <w:num w:numId="18" w16cid:durableId="1105156957">
-    <w:abstractNumId w:val="15"/>
+    <w:abstractNumId w:val="16"/>
   </w:num>
   <w:num w:numId="19" w16cid:durableId="973020555">
+    <w:abstractNumId w:val="18"/>
+  </w:num>
+  <w:num w:numId="20" w16cid:durableId="2070422878">
     <w:abstractNumId w:val="17"/>
   </w:num>
-  <w:num w:numId="20" w16cid:durableId="2070422878">
-    <w:abstractNumId w:val="16"/>
+  <w:num w:numId="21" w16cid:durableId="1885561352">
+    <w:abstractNumId w:val="15"/>
   </w:num>
 </w:numbering>
 </file>
@@ -2962,7 +4014,6 @@
   <w:style w:type="character" w:default="1" w:styleId="DefaultParagraphFont">
     <w:name w:val="Default Paragraph Font"/>
     <w:uiPriority w:val="1"/>
-    <w:semiHidden/>
     <w:unhideWhenUsed/>
   </w:style>
   <w:style w:type="table" w:default="1" w:styleId="TableNormal">
@@ -13760,6 +14811,36 @@
     <w:rPr>
       <w:color w:val="605E5C"/>
       <w:shd w:val="clear" w:color="auto" w:fill="E1DFDD"/>
+    </w:rPr>
+  </w:style>
+  <w:style w:type="paragraph" w:styleId="HTMLPreformatted">
+    <w:name w:val="HTML Preformatted"/>
+    <w:basedOn w:val="Normal"/>
+    <w:link w:val="HTMLPreformattedChar"/>
+    <w:uiPriority w:val="99"/>
+    <w:semiHidden/>
+    <w:unhideWhenUsed/>
+    <w:rsid w:val="00DA0FAC"/>
+    <w:pPr>
+      <w:spacing w:after="0" w:line="240" w:lineRule="auto"/>
+    </w:pPr>
+    <w:rPr>
+      <w:rFonts w:ascii="Consolas" w:hAnsi="Consolas"/>
+      <w:sz w:val="20"/>
+      <w:szCs w:val="20"/>
+    </w:rPr>
+  </w:style>
+  <w:style w:type="character" w:customStyle="1" w:styleId="HTMLPreformattedChar">
+    <w:name w:val="HTML Preformatted Char"/>
+    <w:basedOn w:val="DefaultParagraphFont"/>
+    <w:link w:val="HTMLPreformatted"/>
+    <w:uiPriority w:val="99"/>
+    <w:semiHidden/>
+    <w:rsid w:val="00DA0FAC"/>
+    <w:rPr>
+      <w:rFonts w:ascii="Consolas" w:hAnsi="Consolas"/>
+      <w:sz w:val="20"/>
+      <w:szCs w:val="20"/>
     </w:rPr>
   </w:style>
 </w:styles>

</xml_diff>

<commit_message>
Added Screenshots and log files
</commit_message>
<xml_diff>
--- a/ACEest_Assignment1_Deliverables.docx
+++ b/ACEest_Assignment1_Deliverables.docx
@@ -175,13 +175,23 @@
         </w:rPr>
         <w:t xml:space="preserve"> </w:t>
       </w:r>
+      <w:proofErr w:type="spellStart"/>
       <w:r>
         <w:rPr>
           <w:b/>
           <w:bCs/>
           <w:color w:val="EE0000"/>
         </w:rPr>
-        <w:t xml:space="preserve">aceest-fitness” folder. </w:t>
+        <w:t>aceest</w:t>
+      </w:r>
+      <w:proofErr w:type="spellEnd"/>
+      <w:r>
+        <w:rPr>
+          <w:b/>
+          <w:bCs/>
+          <w:color w:val="EE0000"/>
+        </w:rPr>
+        <w:t xml:space="preserve">-fitness” folder. </w:t>
       </w:r>
     </w:p>
     <w:p>
@@ -319,7 +329,15 @@
         </w:numPr>
       </w:pPr>
       <w:r>
-        <w:t>requirements.txt — Flask 3.0.3 and pytest 8.3.3.</w:t>
+        <w:t xml:space="preserve">requirements.txt — Flask 3.0.3 and </w:t>
+      </w:r>
+      <w:proofErr w:type="spellStart"/>
+      <w:r>
+        <w:t>pytest</w:t>
+      </w:r>
+      <w:proofErr w:type="spellEnd"/>
+      <w:r>
+        <w:t xml:space="preserve"> 8.3.3.</w:t>
       </w:r>
     </w:p>
     <w:p>
@@ -711,8 +729,30 @@
         <w:rPr>
           <w:lang w:val="en-IN"/>
         </w:rPr>
-        <w:t>python3 -m venv .venv</w:t>
+        <w:t xml:space="preserve">python3 -m </w:t>
       </w:r>
+      <w:proofErr w:type="spellStart"/>
+      <w:r>
+        <w:rPr>
+          <w:lang w:val="en-IN"/>
+        </w:rPr>
+        <w:t>venv</w:t>
+      </w:r>
+      <w:proofErr w:type="spellEnd"/>
+      <w:r>
+        <w:rPr>
+          <w:lang w:val="en-IN"/>
+        </w:rPr>
+        <w:t xml:space="preserve"> .</w:t>
+      </w:r>
+      <w:proofErr w:type="spellStart"/>
+      <w:r>
+        <w:rPr>
+          <w:lang w:val="en-IN"/>
+        </w:rPr>
+        <w:t>venv</w:t>
+      </w:r>
+      <w:proofErr w:type="spellEnd"/>
     </w:p>
     <w:p>
       <w:pPr>
@@ -725,7 +765,21 @@
         <w:rPr>
           <w:lang w:val="en-IN"/>
         </w:rPr>
-        <w:t>source .venv/bin/activate</w:t>
+        <w:t>source .</w:t>
+      </w:r>
+      <w:proofErr w:type="spellStart"/>
+      <w:r>
+        <w:rPr>
+          <w:lang w:val="en-IN"/>
+        </w:rPr>
+        <w:t>venv</w:t>
+      </w:r>
+      <w:proofErr w:type="spellEnd"/>
+      <w:r>
+        <w:rPr>
+          <w:lang w:val="en-IN"/>
+        </w:rPr>
+        <w:t>/bin/activate</w:t>
       </w:r>
     </w:p>
     <w:p>
@@ -1261,8 +1315,13 @@
         <w:t>5</w:t>
       </w:r>
       <w:r>
-        <w:t>. Test Suite — Pytest</w:t>
+        <w:t xml:space="preserve">. Test Suite — </w:t>
       </w:r>
+      <w:proofErr w:type="spellStart"/>
+      <w:r>
+        <w:t>Pytest</w:t>
+      </w:r>
+      <w:proofErr w:type="spellEnd"/>
     </w:p>
     <w:p>
       <w:pPr>
@@ -1373,7 +1432,21 @@
           <w:rPr>
             <w:rStyle w:val="Hyperlink"/>
           </w:rPr>
-          <w:t>aceest-fitness/tests/test_app.py at main · 2025tm93239/aceest-fitness · GitHub</w:t>
+          <w:t>aceest-fitness/tests/test_app.py at main · 2025tm93239/</w:t>
+        </w:r>
+        <w:proofErr w:type="spellStart"/>
+        <w:r>
+          <w:rPr>
+            <w:rStyle w:val="Hyperlink"/>
+          </w:rPr>
+          <w:t>aceest</w:t>
+        </w:r>
+        <w:proofErr w:type="spellEnd"/>
+        <w:r>
+          <w:rPr>
+            <w:rStyle w:val="Hyperlink"/>
+          </w:rPr>
+          <w:t>-fitness · GitHub</w:t>
         </w:r>
       </w:hyperlink>
     </w:p>
@@ -1410,11 +1483,33 @@
         <w:ind w:left="720"/>
       </w:pPr>
       <w:hyperlink r:id="rId23" w:history="1">
+        <w:proofErr w:type="spellStart"/>
         <w:r>
           <w:rPr>
             <w:rStyle w:val="Hyperlink"/>
           </w:rPr>
-          <w:t>aceest-fitness/pytest.ini at main · 2025tm93239/aceest-fitness · GitHub</w:t>
+          <w:t>aceest</w:t>
+        </w:r>
+        <w:proofErr w:type="spellEnd"/>
+        <w:r>
+          <w:rPr>
+            <w:rStyle w:val="Hyperlink"/>
+          </w:rPr>
+          <w:t>-fitness/pytest.ini at main · 2025tm93239/</w:t>
+        </w:r>
+        <w:proofErr w:type="spellStart"/>
+        <w:r>
+          <w:rPr>
+            <w:rStyle w:val="Hyperlink"/>
+          </w:rPr>
+          <w:t>aceest</w:t>
+        </w:r>
+        <w:proofErr w:type="spellEnd"/>
+        <w:r>
+          <w:rPr>
+            <w:rStyle w:val="Hyperlink"/>
+          </w:rPr>
+          <w:t>-fitness · GitHub</w:t>
         </w:r>
       </w:hyperlink>
     </w:p>
@@ -1438,7 +1533,15 @@
         <w:ind w:left="720"/>
       </w:pPr>
       <w:r>
-        <w:t>Eight tests total; run with: pytest -v</w:t>
+        <w:t xml:space="preserve">Eight tests total; run with: </w:t>
+      </w:r>
+      <w:proofErr w:type="spellStart"/>
+      <w:r>
+        <w:t>pytest</w:t>
+      </w:r>
+      <w:proofErr w:type="spellEnd"/>
+      <w:r>
+        <w:t xml:space="preserve"> -v</w:t>
       </w:r>
     </w:p>
     <w:p>
@@ -1562,7 +1665,25 @@
           <w:bCs/>
           <w:lang w:val="en-IN"/>
         </w:rPr>
-        <w:t>cd aceest-fitness</w:t>
+        <w:t xml:space="preserve">cd </w:t>
+      </w:r>
+      <w:proofErr w:type="spellStart"/>
+      <w:r>
+        <w:rPr>
+          <w:b/>
+          <w:bCs/>
+          <w:lang w:val="en-IN"/>
+        </w:rPr>
+        <w:t>aceest</w:t>
+      </w:r>
+      <w:proofErr w:type="spellEnd"/>
+      <w:r>
+        <w:rPr>
+          <w:b/>
+          <w:bCs/>
+          <w:lang w:val="en-IN"/>
+        </w:rPr>
+        <w:t>-fitness</w:t>
       </w:r>
     </w:p>
     <w:p>
@@ -1585,7 +1706,25 @@
           <w:bCs/>
           <w:lang w:val="en-IN"/>
         </w:rPr>
-        <w:t>source .venv/bin/activate</w:t>
+        <w:t>source .</w:t>
+      </w:r>
+      <w:proofErr w:type="spellStart"/>
+      <w:r>
+        <w:rPr>
+          <w:b/>
+          <w:bCs/>
+          <w:lang w:val="en-IN"/>
+        </w:rPr>
+        <w:t>venv</w:t>
+      </w:r>
+      <w:proofErr w:type="spellEnd"/>
+      <w:r>
+        <w:rPr>
+          <w:b/>
+          <w:bCs/>
+          <w:lang w:val="en-IN"/>
+        </w:rPr>
+        <w:t>/bin/activate</w:t>
       </w:r>
     </w:p>
     <w:p>
@@ -1631,7 +1770,25 @@
           <w:bCs/>
           <w:lang w:val="en-IN"/>
         </w:rPr>
-        <w:t>python3 -m pytest -v</w:t>
+        <w:t xml:space="preserve">python3 -m </w:t>
+      </w:r>
+      <w:proofErr w:type="spellStart"/>
+      <w:r>
+        <w:rPr>
+          <w:b/>
+          <w:bCs/>
+          <w:lang w:val="en-IN"/>
+        </w:rPr>
+        <w:t>pytest</w:t>
+      </w:r>
+      <w:proofErr w:type="spellEnd"/>
+      <w:r>
+        <w:rPr>
+          <w:b/>
+          <w:bCs/>
+          <w:lang w:val="en-IN"/>
+        </w:rPr>
+        <w:t xml:space="preserve"> -v</w:t>
       </w:r>
     </w:p>
     <w:p>
@@ -1826,7 +1983,15 @@
         <w:ind w:left="720"/>
       </w:pPr>
       <w:r>
-        <w:t>python:3.9-slim base; installs requirements and Gunicorn; non-root user; exposes port 5000; includes tests for containerized pytest.</w:t>
+        <w:t xml:space="preserve">python:3.9-slim base; installs requirements and Gunicorn; non-root user; exposes port 5000; includes tests for containerized </w:t>
+      </w:r>
+      <w:proofErr w:type="spellStart"/>
+      <w:r>
+        <w:t>pytest</w:t>
+      </w:r>
+      <w:proofErr w:type="spellEnd"/>
+      <w:r>
+        <w:t>.</w:t>
       </w:r>
     </w:p>
     <w:p>
@@ -1898,8 +2063,133 @@
     </w:p>
     <w:p>
       <w:pPr>
+        <w:pStyle w:val="ListParagraph"/>
+        <w:numPr>
+          <w:ilvl w:val="0"/>
+          <w:numId w:val="22"/>
+        </w:numPr>
+      </w:pPr>
+      <w:r>
+        <w:t>Run the API container</w:t>
+      </w:r>
+      <w:r>
+        <w:t xml:space="preserve"> an verified </w:t>
+      </w:r>
+    </w:p>
+    <w:p>
+      <w:pPr>
+        <w:pStyle w:val="ListParagraph"/>
+        <w:ind w:left="1080"/>
+      </w:pPr>
+      <w:hyperlink r:id="rId29" w:history="1">
+        <w:r>
+          <w:rPr>
+            <w:rStyle w:val="Hyperlink"/>
+          </w:rPr>
+          <w:t>http://127.0.0.1:5000/</w:t>
+        </w:r>
+      </w:hyperlink>
+    </w:p>
+    <w:p>
+      <w:pPr>
+        <w:pStyle w:val="ListParagraph"/>
+        <w:ind w:left="1080"/>
+      </w:pPr>
+    </w:p>
+    <w:p>
+      <w:pPr>
         <w:ind w:left="720"/>
       </w:pPr>
+      <w:r>
+        <w:drawing>
+          <wp:inline distT="0" distB="0" distL="0" distR="0" wp14:anchorId="210D04C5" wp14:editId="122A17D9">
+            <wp:extent cx="5486400" cy="735330"/>
+            <wp:effectExtent l="0" t="0" r="0" b="7620"/>
+            <wp:docPr id="525672250" name="Picture 1"/>
+            <wp:cNvGraphicFramePr>
+              <a:graphicFrameLocks xmlns:a="http://schemas.openxmlformats.org/drawingml/2006/main" noChangeAspect="1"/>
+            </wp:cNvGraphicFramePr>
+            <a:graphic xmlns:a="http://schemas.openxmlformats.org/drawingml/2006/main">
+              <a:graphicData uri="http://schemas.openxmlformats.org/drawingml/2006/picture">
+                <pic:pic xmlns:pic="http://schemas.openxmlformats.org/drawingml/2006/picture">
+                  <pic:nvPicPr>
+                    <pic:cNvPr id="525672250" name=""/>
+                    <pic:cNvPicPr/>
+                  </pic:nvPicPr>
+                  <pic:blipFill>
+                    <a:blip r:embed="rId30"/>
+                    <a:stretch>
+                      <a:fillRect/>
+                    </a:stretch>
+                  </pic:blipFill>
+                  <pic:spPr>
+                    <a:xfrm>
+                      <a:off x="0" y="0"/>
+                      <a:ext cx="5486400" cy="735330"/>
+                    </a:xfrm>
+                    <a:prstGeom prst="rect">
+                      <a:avLst/>
+                    </a:prstGeom>
+                  </pic:spPr>
+                </pic:pic>
+              </a:graphicData>
+            </a:graphic>
+          </wp:inline>
+        </w:drawing>
+      </w:r>
+    </w:p>
+    <w:p>
+      <w:pPr>
+        <w:ind w:left="720"/>
+      </w:pPr>
+      <w:r>
+        <w:t>Running tests inside the Image</w:t>
+      </w:r>
+    </w:p>
+    <w:p>
+      <w:pPr>
+        <w:ind w:left="720"/>
+      </w:pPr>
+      <w:r>
+        <w:drawing>
+          <wp:inline distT="0" distB="0" distL="0" distR="0" wp14:anchorId="1C0E914D" wp14:editId="41B704FF">
+            <wp:extent cx="5486400" cy="1765300"/>
+            <wp:effectExtent l="0" t="0" r="0" b="6350"/>
+            <wp:docPr id="1316384640" name="Picture 1"/>
+            <wp:cNvGraphicFramePr>
+              <a:graphicFrameLocks xmlns:a="http://schemas.openxmlformats.org/drawingml/2006/main" noChangeAspect="1"/>
+            </wp:cNvGraphicFramePr>
+            <a:graphic xmlns:a="http://schemas.openxmlformats.org/drawingml/2006/main">
+              <a:graphicData uri="http://schemas.openxmlformats.org/drawingml/2006/picture">
+                <pic:pic xmlns:pic="http://schemas.openxmlformats.org/drawingml/2006/picture">
+                  <pic:nvPicPr>
+                    <pic:cNvPr id="1316384640" name=""/>
+                    <pic:cNvPicPr/>
+                  </pic:nvPicPr>
+                  <pic:blipFill>
+                    <a:blip r:embed="rId31"/>
+                    <a:stretch>
+                      <a:fillRect/>
+                    </a:stretch>
+                  </pic:blipFill>
+                  <pic:spPr>
+                    <a:xfrm>
+                      <a:off x="0" y="0"/>
+                      <a:ext cx="5486400" cy="1765300"/>
+                    </a:xfrm>
+                    <a:prstGeom prst="rect">
+                      <a:avLst/>
+                    </a:prstGeom>
+                  </pic:spPr>
+                </pic:pic>
+              </a:graphicData>
+            </a:graphic>
+          </wp:inline>
+        </w:drawing>
+      </w:r>
+      <w:r>
+        <w:t xml:space="preserve"> </w:t>
+      </w:r>
     </w:p>
     <w:p>
       <w:pPr>
@@ -1914,8 +2204,69 @@
         <w:ind w:firstLine="360"/>
       </w:pPr>
       <w:r>
-        <w:t>File: .github/workflows/main.yml</w:t>
+        <w:t>File: .</w:t>
       </w:r>
+      <w:proofErr w:type="spellStart"/>
+      <w:r>
+        <w:t>github</w:t>
+      </w:r>
+      <w:proofErr w:type="spellEnd"/>
+      <w:r>
+        <w:t>/workflows/</w:t>
+      </w:r>
+      <w:proofErr w:type="spellStart"/>
+      <w:r>
+        <w:t>main.yml</w:t>
+      </w:r>
+      <w:proofErr w:type="spellEnd"/>
+    </w:p>
+    <w:p>
+      <w:pPr>
+        <w:ind w:firstLine="360"/>
+      </w:pPr>
+      <w:r>
+        <w:lastRenderedPageBreak/>
+        <w:drawing>
+          <wp:inline distT="0" distB="0" distL="0" distR="0" wp14:anchorId="6C4C2BA7" wp14:editId="67E35A21">
+            <wp:extent cx="5486400" cy="3409950"/>
+            <wp:effectExtent l="0" t="0" r="0" b="0"/>
+            <wp:docPr id="1872926651" name="Picture 1"/>
+            <wp:cNvGraphicFramePr>
+              <a:graphicFrameLocks xmlns:a="http://schemas.openxmlformats.org/drawingml/2006/main" noChangeAspect="1"/>
+            </wp:cNvGraphicFramePr>
+            <a:graphic xmlns:a="http://schemas.openxmlformats.org/drawingml/2006/main">
+              <a:graphicData uri="http://schemas.openxmlformats.org/drawingml/2006/picture">
+                <pic:pic xmlns:pic="http://schemas.openxmlformats.org/drawingml/2006/picture">
+                  <pic:nvPicPr>
+                    <pic:cNvPr id="1872926651" name=""/>
+                    <pic:cNvPicPr/>
+                  </pic:nvPicPr>
+                  <pic:blipFill>
+                    <a:blip r:embed="rId32"/>
+                    <a:stretch>
+                      <a:fillRect/>
+                    </a:stretch>
+                  </pic:blipFill>
+                  <pic:spPr>
+                    <a:xfrm>
+                      <a:off x="0" y="0"/>
+                      <a:ext cx="5486400" cy="3409950"/>
+                    </a:xfrm>
+                    <a:prstGeom prst="rect">
+                      <a:avLst/>
+                    </a:prstGeom>
+                  </pic:spPr>
+                </pic:pic>
+              </a:graphicData>
+            </a:graphic>
+          </wp:inline>
+        </w:drawing>
+      </w:r>
+    </w:p>
+    <w:p>
+      <w:pPr>
+        <w:ind w:firstLine="360"/>
+      </w:pPr>
     </w:p>
     <w:p>
       <w:pPr>
@@ -1926,7 +2277,7 @@
         </w:numPr>
         <w:ind w:left="360"/>
       </w:pPr>
-      <w:hyperlink r:id="rId29" w:history="1">
+      <w:hyperlink r:id="rId33" w:history="1">
         <w:r>
           <w:rPr>
             <w:rStyle w:val="Hyperlink"/>
@@ -1954,7 +2305,15 @@
         </w:numPr>
       </w:pPr>
       <w:r>
-        <w:t>Trigger: push and pull_request on main/master</w:t>
+        <w:t xml:space="preserve">Trigger: push and </w:t>
+      </w:r>
+      <w:proofErr w:type="spellStart"/>
+      <w:r>
+        <w:t>pull_request</w:t>
+      </w:r>
+      <w:proofErr w:type="spellEnd"/>
+      <w:r>
+        <w:t xml:space="preserve"> on main/master</w:t>
       </w:r>
     </w:p>
     <w:p>
@@ -1990,7 +2349,15 @@
         </w:numPr>
       </w:pPr>
       <w:r>
-        <w:t>Automated testing: pytest inside container</w:t>
+        <w:t xml:space="preserve">Automated testing: </w:t>
+      </w:r>
+      <w:proofErr w:type="spellStart"/>
+      <w:r>
+        <w:t>pytest</w:t>
+      </w:r>
+      <w:proofErr w:type="spellEnd"/>
+      <w:r>
+        <w:t xml:space="preserve"> inside container</w:t>
       </w:r>
     </w:p>
     <w:p>
@@ -2009,40 +2376,133 @@
           <w:ilvl w:val="0"/>
           <w:numId w:val="0"/>
         </w:numPr>
-        <w:ind w:left="720"/>
         <w:rPr>
-          <w:color w:val="EE0000"/>
+          <w:b/>
+          <w:bCs/>
         </w:rPr>
       </w:pPr>
       <w:r>
         <w:rPr>
-          <w:color w:val="EE0000"/>
+          <w:b/>
+          <w:bCs/>
         </w:rPr>
-        <w:t>&lt;</w:t>
+        <w:t xml:space="preserve">As we have configured using </w:t>
       </w:r>
+      <w:proofErr w:type="spellStart"/>
       <w:r>
         <w:rPr>
-          <w:color w:val="EE0000"/>
+          <w:b/>
+          <w:bCs/>
         </w:rPr>
-        <w:t xml:space="preserve">Add </w:t>
+        <w:t>main.yml</w:t>
       </w:r>
+      <w:proofErr w:type="spellEnd"/>
       <w:r>
         <w:rPr>
-          <w:color w:val="EE0000"/>
+          <w:b/>
+          <w:bCs/>
         </w:rPr>
-        <w:t xml:space="preserve">Github build </w:t>
+        <w:t xml:space="preserve"> file, build is triggering on each commit. </w:t>
       </w:r>
+    </w:p>
+    <w:p>
+      <w:pPr>
+        <w:pStyle w:val="ListBullet"/>
+        <w:numPr>
+          <w:ilvl w:val="0"/>
+          <w:numId w:val="0"/>
+        </w:numPr>
+      </w:pPr>
+    </w:p>
+    <w:p>
+      <w:pPr>
+        <w:pStyle w:val="ListBullet"/>
+        <w:numPr>
+          <w:ilvl w:val="0"/>
+          <w:numId w:val="0"/>
+        </w:numPr>
+      </w:pPr>
       <w:r>
-        <w:rPr>
-          <w:color w:val="EE0000"/>
-        </w:rPr>
-        <w:t>screenshots</w:t>
+        <w:lastRenderedPageBreak/>
+        <w:drawing>
+          <wp:inline distT="0" distB="0" distL="0" distR="0" wp14:anchorId="35058F3E" wp14:editId="5189D35E">
+            <wp:extent cx="5486400" cy="2680335"/>
+            <wp:effectExtent l="0" t="0" r="0" b="5715"/>
+            <wp:docPr id="545961694" name="Picture 1"/>
+            <wp:cNvGraphicFramePr>
+              <a:graphicFrameLocks xmlns:a="http://schemas.openxmlformats.org/drawingml/2006/main" noChangeAspect="1"/>
+            </wp:cNvGraphicFramePr>
+            <a:graphic xmlns:a="http://schemas.openxmlformats.org/drawingml/2006/main">
+              <a:graphicData uri="http://schemas.openxmlformats.org/drawingml/2006/picture">
+                <pic:pic xmlns:pic="http://schemas.openxmlformats.org/drawingml/2006/picture">
+                  <pic:nvPicPr>
+                    <pic:cNvPr id="545961694" name=""/>
+                    <pic:cNvPicPr/>
+                  </pic:nvPicPr>
+                  <pic:blipFill>
+                    <a:blip r:embed="rId34"/>
+                    <a:stretch>
+                      <a:fillRect/>
+                    </a:stretch>
+                  </pic:blipFill>
+                  <pic:spPr>
+                    <a:xfrm>
+                      <a:off x="0" y="0"/>
+                      <a:ext cx="5486400" cy="2680335"/>
+                    </a:xfrm>
+                    <a:prstGeom prst="rect">
+                      <a:avLst/>
+                    </a:prstGeom>
+                  </pic:spPr>
+                </pic:pic>
+              </a:graphicData>
+            </a:graphic>
+          </wp:inline>
+        </w:drawing>
       </w:r>
+    </w:p>
+    <w:p>
+      <w:pPr>
+        <w:pStyle w:val="Heading2"/>
+      </w:pPr>
+    </w:p>
+    <w:p>
       <w:r>
-        <w:rPr>
-          <w:color w:val="EE0000"/>
-        </w:rPr>
-        <w:t>&gt;</w:t>
+        <w:drawing>
+          <wp:inline distT="0" distB="0" distL="0" distR="0" wp14:anchorId="4C46F770" wp14:editId="025517F6">
+            <wp:extent cx="5486400" cy="2806065"/>
+            <wp:effectExtent l="0" t="0" r="0" b="0"/>
+            <wp:docPr id="2059320796" name="Picture 1"/>
+            <wp:cNvGraphicFramePr>
+              <a:graphicFrameLocks xmlns:a="http://schemas.openxmlformats.org/drawingml/2006/main" noChangeAspect="1"/>
+            </wp:cNvGraphicFramePr>
+            <a:graphic xmlns:a="http://schemas.openxmlformats.org/drawingml/2006/main">
+              <a:graphicData uri="http://schemas.openxmlformats.org/drawingml/2006/picture">
+                <pic:pic xmlns:pic="http://schemas.openxmlformats.org/drawingml/2006/picture">
+                  <pic:nvPicPr>
+                    <pic:cNvPr id="2059320796" name=""/>
+                    <pic:cNvPicPr/>
+                  </pic:nvPicPr>
+                  <pic:blipFill>
+                    <a:blip r:embed="rId35"/>
+                    <a:stretch>
+                      <a:fillRect/>
+                    </a:stretch>
+                  </pic:blipFill>
+                  <pic:spPr>
+                    <a:xfrm>
+                      <a:off x="0" y="0"/>
+                      <a:ext cx="5486400" cy="2806065"/>
+                    </a:xfrm>
+                    <a:prstGeom prst="rect">
+                      <a:avLst/>
+                    </a:prstGeom>
+                  </pic:spPr>
+                </pic:pic>
+              </a:graphicData>
+            </a:graphic>
+          </wp:inline>
+        </w:drawing>
       </w:r>
     </w:p>
     <w:p>
@@ -2055,7 +2515,327 @@
     </w:p>
     <w:p>
       <w:r>
-        <w:t>Jenkinsfile — Pipeline from SCM. Stages: checkout, install, compileall, pytest on agent, docker build, pytest in container.</w:t>
+        <w:t xml:space="preserve">Jenkinsfile — Pipeline from SCM. Stages: checkout, install, compileall, pytest on agent, docker build, </w:t>
+      </w:r>
+      <w:proofErr w:type="spellStart"/>
+      <w:r>
+        <w:t>pytest</w:t>
+      </w:r>
+      <w:proofErr w:type="spellEnd"/>
+      <w:r>
+        <w:t xml:space="preserve"> in container.</w:t>
+      </w:r>
+    </w:p>
+    <w:p>
+      <w:pPr>
+        <w:pStyle w:val="ListParagraph"/>
+        <w:numPr>
+          <w:ilvl w:val="0"/>
+          <w:numId w:val="23"/>
+        </w:numPr>
+      </w:pPr>
+      <w:r>
+        <w:t>Logged-in Jenkins using default username and password</w:t>
+      </w:r>
+    </w:p>
+    <w:p>
+      <w:r>
+        <w:lastRenderedPageBreak/>
+        <w:drawing>
+          <wp:inline distT="0" distB="0" distL="0" distR="0" wp14:anchorId="63ADD82C" wp14:editId="2CD28FDA">
+            <wp:extent cx="5486400" cy="2196465"/>
+            <wp:effectExtent l="0" t="0" r="0" b="0"/>
+            <wp:docPr id="919621810" name="Picture 1"/>
+            <wp:cNvGraphicFramePr>
+              <a:graphicFrameLocks xmlns:a="http://schemas.openxmlformats.org/drawingml/2006/main" noChangeAspect="1"/>
+            </wp:cNvGraphicFramePr>
+            <a:graphic xmlns:a="http://schemas.openxmlformats.org/drawingml/2006/main">
+              <a:graphicData uri="http://schemas.openxmlformats.org/drawingml/2006/picture">
+                <pic:pic xmlns:pic="http://schemas.openxmlformats.org/drawingml/2006/picture">
+                  <pic:nvPicPr>
+                    <pic:cNvPr id="919621810" name=""/>
+                    <pic:cNvPicPr/>
+                  </pic:nvPicPr>
+                  <pic:blipFill>
+                    <a:blip r:embed="rId36"/>
+                    <a:stretch>
+                      <a:fillRect/>
+                    </a:stretch>
+                  </pic:blipFill>
+                  <pic:spPr>
+                    <a:xfrm>
+                      <a:off x="0" y="0"/>
+                      <a:ext cx="5486400" cy="2196465"/>
+                    </a:xfrm>
+                    <a:prstGeom prst="rect">
+                      <a:avLst/>
+                    </a:prstGeom>
+                  </pic:spPr>
+                </pic:pic>
+              </a:graphicData>
+            </a:graphic>
+          </wp:inline>
+        </w:drawing>
+      </w:r>
+    </w:p>
+    <w:p>
+      <w:pPr>
+        <w:pStyle w:val="ListParagraph"/>
+        <w:numPr>
+          <w:ilvl w:val="0"/>
+          <w:numId w:val="23"/>
+        </w:numPr>
+      </w:pPr>
+      <w:r>
+        <w:t>Created a new pipeline</w:t>
+      </w:r>
+    </w:p>
+    <w:p>
+      <w:r>
+        <w:drawing>
+          <wp:inline distT="0" distB="0" distL="0" distR="0" wp14:anchorId="2D8D18E8" wp14:editId="0664E0EE">
+            <wp:extent cx="5486400" cy="2785110"/>
+            <wp:effectExtent l="0" t="0" r="0" b="0"/>
+            <wp:docPr id="1779166139" name="Picture 1"/>
+            <wp:cNvGraphicFramePr>
+              <a:graphicFrameLocks xmlns:a="http://schemas.openxmlformats.org/drawingml/2006/main" noChangeAspect="1"/>
+            </wp:cNvGraphicFramePr>
+            <a:graphic xmlns:a="http://schemas.openxmlformats.org/drawingml/2006/main">
+              <a:graphicData uri="http://schemas.openxmlformats.org/drawingml/2006/picture">
+                <pic:pic xmlns:pic="http://schemas.openxmlformats.org/drawingml/2006/picture">
+                  <pic:nvPicPr>
+                    <pic:cNvPr id="1779166139" name=""/>
+                    <pic:cNvPicPr/>
+                  </pic:nvPicPr>
+                  <pic:blipFill>
+                    <a:blip r:embed="rId37"/>
+                    <a:stretch>
+                      <a:fillRect/>
+                    </a:stretch>
+                  </pic:blipFill>
+                  <pic:spPr>
+                    <a:xfrm>
+                      <a:off x="0" y="0"/>
+                      <a:ext cx="5486400" cy="2785110"/>
+                    </a:xfrm>
+                    <a:prstGeom prst="rect">
+                      <a:avLst/>
+                    </a:prstGeom>
+                  </pic:spPr>
+                </pic:pic>
+              </a:graphicData>
+            </a:graphic>
+          </wp:inline>
+        </w:drawing>
+      </w:r>
+    </w:p>
+    <w:p/>
+    <w:p>
+      <w:pPr>
+        <w:rPr>
+          <w:b/>
+          <w:bCs/>
+        </w:rPr>
+      </w:pPr>
+      <w:r>
+        <w:rPr>
+          <w:b/>
+          <w:bCs/>
+        </w:rPr>
+        <w:t>Completed Success Jenkin build</w:t>
+      </w:r>
+      <w:r>
+        <w:rPr>
+          <w:b/>
+          <w:bCs/>
+        </w:rPr>
+        <w:t xml:space="preserve"> and its build pipeline</w:t>
+      </w:r>
+    </w:p>
+    <w:p>
+      <w:pPr>
+        <w:pStyle w:val="Heading1"/>
+      </w:pPr>
+      <w:r>
+        <w:rPr>
+          <w:rFonts w:asciiTheme="minorHAnsi" w:eastAsiaTheme="minorEastAsia" w:hAnsiTheme="minorHAnsi" w:cstheme="minorBidi"/>
+          <w:b w:val="0"/>
+          <w:bCs w:val="0"/>
+          <w:color w:val="auto"/>
+          <w:sz w:val="22"/>
+          <w:szCs w:val="22"/>
+        </w:rPr>
+        <w:lastRenderedPageBreak/>
+        <w:drawing>
+          <wp:inline distT="0" distB="0" distL="0" distR="0" wp14:anchorId="10A3E2CD" wp14:editId="4FE753F5">
+            <wp:extent cx="5486400" cy="2382520"/>
+            <wp:effectExtent l="0" t="0" r="0" b="0"/>
+            <wp:docPr id="681872356" name="Picture 1"/>
+            <wp:cNvGraphicFramePr>
+              <a:graphicFrameLocks xmlns:a="http://schemas.openxmlformats.org/drawingml/2006/main" noChangeAspect="1"/>
+            </wp:cNvGraphicFramePr>
+            <a:graphic xmlns:a="http://schemas.openxmlformats.org/drawingml/2006/main">
+              <a:graphicData uri="http://schemas.openxmlformats.org/drawingml/2006/picture">
+                <pic:pic xmlns:pic="http://schemas.openxmlformats.org/drawingml/2006/picture">
+                  <pic:nvPicPr>
+                    <pic:cNvPr id="681872356" name=""/>
+                    <pic:cNvPicPr/>
+                  </pic:nvPicPr>
+                  <pic:blipFill>
+                    <a:blip r:embed="rId38"/>
+                    <a:stretch>
+                      <a:fillRect/>
+                    </a:stretch>
+                  </pic:blipFill>
+                  <pic:spPr>
+                    <a:xfrm>
+                      <a:off x="0" y="0"/>
+                      <a:ext cx="5486400" cy="2382520"/>
+                    </a:xfrm>
+                    <a:prstGeom prst="rect">
+                      <a:avLst/>
+                    </a:prstGeom>
+                  </pic:spPr>
+                </pic:pic>
+              </a:graphicData>
+            </a:graphic>
+          </wp:inline>
+        </w:drawing>
+      </w:r>
+    </w:p>
+    <w:p/>
+    <w:p>
+      <w:r>
+        <w:t xml:space="preserve">Pipeline Steps: </w:t>
+      </w:r>
+    </w:p>
+    <w:p>
+      <w:r>
+        <w:drawing>
+          <wp:inline distT="0" distB="0" distL="0" distR="0" wp14:anchorId="7535921B" wp14:editId="47A0A485">
+            <wp:extent cx="5486400" cy="2799080"/>
+            <wp:effectExtent l="0" t="0" r="0" b="1270"/>
+            <wp:docPr id="1356796240" name="Picture 1"/>
+            <wp:cNvGraphicFramePr>
+              <a:graphicFrameLocks xmlns:a="http://schemas.openxmlformats.org/drawingml/2006/main" noChangeAspect="1"/>
+            </wp:cNvGraphicFramePr>
+            <a:graphic xmlns:a="http://schemas.openxmlformats.org/drawingml/2006/main">
+              <a:graphicData uri="http://schemas.openxmlformats.org/drawingml/2006/picture">
+                <pic:pic xmlns:pic="http://schemas.openxmlformats.org/drawingml/2006/picture">
+                  <pic:nvPicPr>
+                    <pic:cNvPr id="1356796240" name=""/>
+                    <pic:cNvPicPr/>
+                  </pic:nvPicPr>
+                  <pic:blipFill>
+                    <a:blip r:embed="rId39"/>
+                    <a:stretch>
+                      <a:fillRect/>
+                    </a:stretch>
+                  </pic:blipFill>
+                  <pic:spPr>
+                    <a:xfrm>
+                      <a:off x="0" y="0"/>
+                      <a:ext cx="5486400" cy="2799080"/>
+                    </a:xfrm>
+                    <a:prstGeom prst="rect">
+                      <a:avLst/>
+                    </a:prstGeom>
+                  </pic:spPr>
+                </pic:pic>
+              </a:graphicData>
+            </a:graphic>
+          </wp:inline>
+        </w:drawing>
+      </w:r>
+    </w:p>
+    <w:p/>
+    <w:p>
+      <w:r>
+        <w:t xml:space="preserve">Pipeline Console Output: </w:t>
+      </w:r>
+    </w:p>
+    <w:p>
+      <w:r>
+        <w:lastRenderedPageBreak/>
+        <w:drawing>
+          <wp:inline distT="0" distB="0" distL="0" distR="0" wp14:anchorId="28B8C00D" wp14:editId="3C38C671">
+            <wp:extent cx="5486400" cy="1616710"/>
+            <wp:effectExtent l="0" t="0" r="0" b="2540"/>
+            <wp:docPr id="1501731125" name="Picture 1"/>
+            <wp:cNvGraphicFramePr>
+              <a:graphicFrameLocks xmlns:a="http://schemas.openxmlformats.org/drawingml/2006/main" noChangeAspect="1"/>
+            </wp:cNvGraphicFramePr>
+            <a:graphic xmlns:a="http://schemas.openxmlformats.org/drawingml/2006/main">
+              <a:graphicData uri="http://schemas.openxmlformats.org/drawingml/2006/picture">
+                <pic:pic xmlns:pic="http://schemas.openxmlformats.org/drawingml/2006/picture">
+                  <pic:nvPicPr>
+                    <pic:cNvPr id="1501731125" name=""/>
+                    <pic:cNvPicPr/>
+                  </pic:nvPicPr>
+                  <pic:blipFill>
+                    <a:blip r:embed="rId40"/>
+                    <a:stretch>
+                      <a:fillRect/>
+                    </a:stretch>
+                  </pic:blipFill>
+                  <pic:spPr>
+                    <a:xfrm>
+                      <a:off x="0" y="0"/>
+                      <a:ext cx="5486400" cy="1616710"/>
+                    </a:xfrm>
+                    <a:prstGeom prst="rect">
+                      <a:avLst/>
+                    </a:prstGeom>
+                  </pic:spPr>
+                </pic:pic>
+              </a:graphicData>
+            </a:graphic>
+          </wp:inline>
+        </w:drawing>
+      </w:r>
+    </w:p>
+    <w:p>
+      <w:r>
+        <w:t xml:space="preserve">Pipeline Overview: </w:t>
+      </w:r>
+    </w:p>
+    <w:p>
+      <w:r>
+        <w:drawing>
+          <wp:inline distT="0" distB="0" distL="0" distR="0" wp14:anchorId="67FA0A7B" wp14:editId="70FC991A">
+            <wp:extent cx="5486400" cy="1147445"/>
+            <wp:effectExtent l="0" t="0" r="0" b="0"/>
+            <wp:docPr id="1647765286" name="Picture 1"/>
+            <wp:cNvGraphicFramePr>
+              <a:graphicFrameLocks xmlns:a="http://schemas.openxmlformats.org/drawingml/2006/main" noChangeAspect="1"/>
+            </wp:cNvGraphicFramePr>
+            <a:graphic xmlns:a="http://schemas.openxmlformats.org/drawingml/2006/main">
+              <a:graphicData uri="http://schemas.openxmlformats.org/drawingml/2006/picture">
+                <pic:pic xmlns:pic="http://schemas.openxmlformats.org/drawingml/2006/picture">
+                  <pic:nvPicPr>
+                    <pic:cNvPr id="1647765286" name=""/>
+                    <pic:cNvPicPr/>
+                  </pic:nvPicPr>
+                  <pic:blipFill>
+                    <a:blip r:embed="rId41"/>
+                    <a:stretch>
+                      <a:fillRect/>
+                    </a:stretch>
+                  </pic:blipFill>
+                  <pic:spPr>
+                    <a:xfrm>
+                      <a:off x="0" y="0"/>
+                      <a:ext cx="5486400" cy="1147445"/>
+                    </a:xfrm>
+                    <a:prstGeom prst="rect">
+                      <a:avLst/>
+                    </a:prstGeom>
+                  </pic:spPr>
+                </pic:pic>
+              </a:graphicData>
+            </a:graphic>
+          </wp:inline>
+        </w:drawing>
       </w:r>
     </w:p>
     <w:p>
@@ -2066,9 +2846,8 @@
         <w:t>6. Documentation — README.md</w:t>
       </w:r>
     </w:p>
-    <w:p/>
     <w:p>
-      <w:hyperlink r:id="rId30" w:history="1">
+      <w:hyperlink r:id="rId42" w:history="1">
         <w:r>
           <w:rPr>
             <w:rStyle w:val="Hyperlink"/>
@@ -2077,13 +2856,23 @@
         </w:r>
       </w:hyperlink>
     </w:p>
+    <w:p>
+      <w:hyperlink r:id="rId43" w:history="1">
+        <w:r>
+          <w:rPr>
+            <w:rStyle w:val="Hyperlink"/>
+          </w:rPr>
+          <w:t>https://github.com/2025tm93239/aceest-fitness/blob/main/docs/JENKINS-SETUP.md</w:t>
+        </w:r>
+      </w:hyperlink>
+    </w:p>
     <w:p/>
     <w:p>
       <w:pPr>
         <w:pStyle w:val="Heading2"/>
         <w:numPr>
           <w:ilvl w:val="1"/>
-          <w:numId w:val="14"/>
+          <w:numId w:val="27"/>
         </w:numPr>
       </w:pPr>
       <w:r>
@@ -2092,82 +2881,10 @@
     </w:p>
     <w:p>
       <w:pPr>
-        <w:pStyle w:val="ListBullet"/>
-        <w:numPr>
-          <w:ilvl w:val="0"/>
-          <w:numId w:val="16"/>
-        </w:numPr>
-      </w:pPr>
-      <w:r>
-        <w:t>git clone https://github.com/2025tm93239/aceest-fitness.git</w:t>
-      </w:r>
-    </w:p>
-    <w:p>
-      <w:pPr>
-        <w:pStyle w:val="ListBullet"/>
-        <w:numPr>
-          <w:ilvl w:val="0"/>
-          <w:numId w:val="16"/>
-        </w:numPr>
-      </w:pPr>
-      <w:r>
-        <w:t>cd aceest-fitness</w:t>
-      </w:r>
-    </w:p>
-    <w:p>
-      <w:pPr>
-        <w:pStyle w:val="ListBullet"/>
-        <w:numPr>
-          <w:ilvl w:val="0"/>
-          <w:numId w:val="16"/>
-        </w:numPr>
-      </w:pPr>
-      <w:r>
-        <w:t>python3 -m venv .venv &amp;&amp; source .venv/bin/activate</w:t>
-      </w:r>
-    </w:p>
-    <w:p>
-      <w:pPr>
-        <w:pStyle w:val="ListBullet"/>
-        <w:numPr>
-          <w:ilvl w:val="0"/>
-          <w:numId w:val="16"/>
-        </w:numPr>
-      </w:pPr>
-      <w:r>
-        <w:t>pip install -r requirements.txt</w:t>
-      </w:r>
-    </w:p>
-    <w:p>
-      <w:pPr>
-        <w:pStyle w:val="ListBullet"/>
-        <w:numPr>
-          <w:ilvl w:val="0"/>
-          <w:numId w:val="16"/>
-        </w:numPr>
-      </w:pPr>
-      <w:r>
-        <w:t>python app.py</w:t>
-      </w:r>
-    </w:p>
-    <w:p>
-      <w:pPr>
-        <w:pStyle w:val="ListBullet"/>
-        <w:numPr>
-          <w:ilvl w:val="0"/>
-          <w:numId w:val="16"/>
-        </w:numPr>
-      </w:pPr>
-      <w:r>
-        <w:t>curl http://127.0.0.1:5000/</w:t>
-      </w:r>
-    </w:p>
-    <w:p>
-      <w:pPr>
         <w:pStyle w:val="Heading2"/>
         <w:numPr>
           <w:ilvl w:val="1"/>
-          <w:numId w:val="16"/>
+          <w:numId w:val="27"/>
         </w:numPr>
       </w:pPr>
       <w:r>
@@ -2176,46 +2893,44 @@
     </w:p>
     <w:p>
       <w:pPr>
-        <w:pStyle w:val="ListBullet"/>
+        <w:pStyle w:val="Heading2"/>
         <w:numPr>
-          <w:ilvl w:val="0"/>
-          <w:numId w:val="20"/>
+          <w:ilvl w:val="1"/>
+          <w:numId w:val="27"/>
         </w:numPr>
       </w:pPr>
       <w:r>
-        <w:t>source .venv/bin/activate</w:t>
+        <w:t xml:space="preserve">Docker Setup </w:t>
+      </w:r>
+      <w:r>
+        <w:t>steps</w:t>
       </w:r>
     </w:p>
     <w:p>
       <w:pPr>
-        <w:pStyle w:val="ListBullet"/>
+        <w:pStyle w:val="Heading2"/>
         <w:numPr>
-          <w:ilvl w:val="0"/>
-          <w:numId w:val="20"/>
+          <w:ilvl w:val="1"/>
+          <w:numId w:val="27"/>
         </w:numPr>
       </w:pPr>
       <w:r>
-        <w:t>pytest -v</w:t>
+        <w:t>Jenkin Setup</w:t>
+      </w:r>
+      <w:r>
+        <w:t xml:space="preserve"> steps</w:t>
       </w:r>
     </w:p>
     <w:p>
       <w:pPr>
-        <w:pStyle w:val="ListBullet"/>
+        <w:pStyle w:val="Heading2"/>
         <w:numPr>
-          <w:ilvl w:val="0"/>
-          <w:numId w:val="20"/>
+          <w:ilvl w:val="1"/>
+          <w:numId w:val="27"/>
         </w:numPr>
       </w:pPr>
       <w:r>
-        <w:t>python3 -m compileall -q app.py aceest tests</w:t>
-      </w:r>
-    </w:p>
-    <w:p>
-      <w:pPr>
-        <w:pStyle w:val="Heading2"/>
-      </w:pPr>
-      <w:r>
-        <w:t>6.3 Jenkins and GitHub Actions integration (overview)</w:t>
+        <w:t>Jenkins and GitHub Actions integration (overview)</w:t>
       </w:r>
     </w:p>
     <w:p>
@@ -2412,6 +3127,119 @@
     </w:lvl>
   </w:abstractNum>
   <w:abstractNum w:abstractNumId="9" w15:restartNumberingAfterBreak="0">
+    <w:nsid w:val="01F41D72"/>
+    <w:multiLevelType w:val="multilevel"/>
+    <w:tmpl w:val="B4BE6CD2"/>
+    <w:lvl w:ilvl="0">
+      <w:start w:val="6"/>
+      <w:numFmt w:val="decimal"/>
+      <w:lvlText w:val="%1"/>
+      <w:lvlJc w:val="left"/>
+      <w:pPr>
+        <w:ind w:left="360" w:hanging="360"/>
+      </w:pPr>
+      <w:rPr>
+        <w:rFonts w:hint="default"/>
+      </w:rPr>
+    </w:lvl>
+    <w:lvl w:ilvl="1">
+      <w:start w:val="1"/>
+      <w:numFmt w:val="decimal"/>
+      <w:lvlText w:val="%1.%2"/>
+      <w:lvlJc w:val="left"/>
+      <w:pPr>
+        <w:ind w:left="360" w:hanging="360"/>
+      </w:pPr>
+      <w:rPr>
+        <w:rFonts w:hint="default"/>
+      </w:rPr>
+    </w:lvl>
+    <w:lvl w:ilvl="2">
+      <w:start w:val="1"/>
+      <w:numFmt w:val="decimal"/>
+      <w:lvlText w:val="%1.%2.%3"/>
+      <w:lvlJc w:val="left"/>
+      <w:pPr>
+        <w:ind w:left="720" w:hanging="720"/>
+      </w:pPr>
+      <w:rPr>
+        <w:rFonts w:hint="default"/>
+      </w:rPr>
+    </w:lvl>
+    <w:lvl w:ilvl="3">
+      <w:start w:val="1"/>
+      <w:numFmt w:val="decimal"/>
+      <w:lvlText w:val="%1.%2.%3.%4"/>
+      <w:lvlJc w:val="left"/>
+      <w:pPr>
+        <w:ind w:left="1080" w:hanging="1080"/>
+      </w:pPr>
+      <w:rPr>
+        <w:rFonts w:hint="default"/>
+      </w:rPr>
+    </w:lvl>
+    <w:lvl w:ilvl="4">
+      <w:start w:val="1"/>
+      <w:numFmt w:val="decimal"/>
+      <w:lvlText w:val="%1.%2.%3.%4.%5"/>
+      <w:lvlJc w:val="left"/>
+      <w:pPr>
+        <w:ind w:left="1080" w:hanging="1080"/>
+      </w:pPr>
+      <w:rPr>
+        <w:rFonts w:hint="default"/>
+      </w:rPr>
+    </w:lvl>
+    <w:lvl w:ilvl="5">
+      <w:start w:val="1"/>
+      <w:numFmt w:val="decimal"/>
+      <w:lvlText w:val="%1.%2.%3.%4.%5.%6"/>
+      <w:lvlJc w:val="left"/>
+      <w:pPr>
+        <w:ind w:left="1440" w:hanging="1440"/>
+      </w:pPr>
+      <w:rPr>
+        <w:rFonts w:hint="default"/>
+      </w:rPr>
+    </w:lvl>
+    <w:lvl w:ilvl="6">
+      <w:start w:val="1"/>
+      <w:numFmt w:val="decimal"/>
+      <w:lvlText w:val="%1.%2.%3.%4.%5.%6.%7"/>
+      <w:lvlJc w:val="left"/>
+      <w:pPr>
+        <w:ind w:left="1440" w:hanging="1440"/>
+      </w:pPr>
+      <w:rPr>
+        <w:rFonts w:hint="default"/>
+      </w:rPr>
+    </w:lvl>
+    <w:lvl w:ilvl="7">
+      <w:start w:val="1"/>
+      <w:numFmt w:val="decimal"/>
+      <w:lvlText w:val="%1.%2.%3.%4.%5.%6.%7.%8"/>
+      <w:lvlJc w:val="left"/>
+      <w:pPr>
+        <w:ind w:left="1800" w:hanging="1800"/>
+      </w:pPr>
+      <w:rPr>
+        <w:rFonts w:hint="default"/>
+      </w:rPr>
+    </w:lvl>
+    <w:lvl w:ilvl="8">
+      <w:start w:val="1"/>
+      <w:numFmt w:val="decimal"/>
+      <w:lvlText w:val="%1.%2.%3.%4.%5.%6.%7.%8.%9"/>
+      <w:lvlJc w:val="left"/>
+      <w:pPr>
+        <w:ind w:left="1800" w:hanging="1800"/>
+      </w:pPr>
+      <w:rPr>
+        <w:rFonts w:hint="default"/>
+      </w:rPr>
+    </w:lvl>
+  </w:abstractNum>
+  <w:abstractNum w:abstractNumId="10" w15:restartNumberingAfterBreak="0">
     <w:nsid w:val="051C2139"/>
     <w:multiLevelType w:val="hybridMultilevel"/>
     <w:tmpl w:val="B8564050"/>
@@ -2500,7 +3328,7 @@
       </w:pPr>
     </w:lvl>
   </w:abstractNum>
-  <w:abstractNum w:abstractNumId="10" w15:restartNumberingAfterBreak="0">
+  <w:abstractNum w:abstractNumId="11" w15:restartNumberingAfterBreak="0">
     <w:nsid w:val="09A7036B"/>
     <w:multiLevelType w:val="hybridMultilevel"/>
     <w:tmpl w:val="DE761A42"/>
@@ -2589,7 +3417,7 @@
       </w:pPr>
     </w:lvl>
   </w:abstractNum>
-  <w:abstractNum w:abstractNumId="11" w15:restartNumberingAfterBreak="0">
+  <w:abstractNum w:abstractNumId="12" w15:restartNumberingAfterBreak="0">
     <w:nsid w:val="10802481"/>
     <w:multiLevelType w:val="hybridMultilevel"/>
     <w:tmpl w:val="5A947A66"/>
@@ -2678,7 +3506,7 @@
       </w:pPr>
     </w:lvl>
   </w:abstractNum>
-  <w:abstractNum w:abstractNumId="12" w15:restartNumberingAfterBreak="0">
+  <w:abstractNum w:abstractNumId="13" w15:restartNumberingAfterBreak="0">
     <w:nsid w:val="135E2A8C"/>
     <w:multiLevelType w:val="hybridMultilevel"/>
     <w:tmpl w:val="E8BE422E"/>
@@ -2767,7 +3595,7 @@
       </w:pPr>
     </w:lvl>
   </w:abstractNum>
-  <w:abstractNum w:abstractNumId="13" w15:restartNumberingAfterBreak="0">
+  <w:abstractNum w:abstractNumId="14" w15:restartNumberingAfterBreak="0">
     <w:nsid w:val="14203A73"/>
     <w:multiLevelType w:val="multilevel"/>
     <w:tmpl w:val="DA824B7A"/>
@@ -2888,7 +3716,7 @@
       </w:rPr>
     </w:lvl>
   </w:abstractNum>
-  <w:abstractNum w:abstractNumId="14" w15:restartNumberingAfterBreak="0">
+  <w:abstractNum w:abstractNumId="15" w15:restartNumberingAfterBreak="0">
     <w:nsid w:val="1F98443A"/>
     <w:multiLevelType w:val="hybridMultilevel"/>
     <w:tmpl w:val="02EEA686"/>
@@ -2977,7 +3805,7 @@
       </w:pPr>
     </w:lvl>
   </w:abstractNum>
-  <w:abstractNum w:abstractNumId="15" w15:restartNumberingAfterBreak="0">
+  <w:abstractNum w:abstractNumId="16" w15:restartNumberingAfterBreak="0">
     <w:nsid w:val="23C44E81"/>
     <w:multiLevelType w:val="hybridMultilevel"/>
     <w:tmpl w:val="9732C17E"/>
@@ -3066,7 +3894,233 @@
       </w:pPr>
     </w:lvl>
   </w:abstractNum>
-  <w:abstractNum w:abstractNumId="16" w15:restartNumberingAfterBreak="0">
+  <w:abstractNum w:abstractNumId="17" w15:restartNumberingAfterBreak="0">
+    <w:nsid w:val="252F3D25"/>
+    <w:multiLevelType w:val="multilevel"/>
+    <w:tmpl w:val="B4BE6CD2"/>
+    <w:lvl w:ilvl="0">
+      <w:start w:val="6"/>
+      <w:numFmt w:val="decimal"/>
+      <w:lvlText w:val="%1"/>
+      <w:lvlJc w:val="left"/>
+      <w:pPr>
+        <w:ind w:left="360" w:hanging="360"/>
+      </w:pPr>
+      <w:rPr>
+        <w:rFonts w:hint="default"/>
+      </w:rPr>
+    </w:lvl>
+    <w:lvl w:ilvl="1">
+      <w:start w:val="1"/>
+      <w:numFmt w:val="decimal"/>
+      <w:lvlText w:val="%1.%2"/>
+      <w:lvlJc w:val="left"/>
+      <w:pPr>
+        <w:ind w:left="360" w:hanging="360"/>
+      </w:pPr>
+      <w:rPr>
+        <w:rFonts w:hint="default"/>
+      </w:rPr>
+    </w:lvl>
+    <w:lvl w:ilvl="2">
+      <w:start w:val="1"/>
+      <w:numFmt w:val="decimal"/>
+      <w:lvlText w:val="%1.%2.%3"/>
+      <w:lvlJc w:val="left"/>
+      <w:pPr>
+        <w:ind w:left="720" w:hanging="720"/>
+      </w:pPr>
+      <w:rPr>
+        <w:rFonts w:hint="default"/>
+      </w:rPr>
+    </w:lvl>
+    <w:lvl w:ilvl="3">
+      <w:start w:val="1"/>
+      <w:numFmt w:val="decimal"/>
+      <w:lvlText w:val="%1.%2.%3.%4"/>
+      <w:lvlJc w:val="left"/>
+      <w:pPr>
+        <w:ind w:left="1080" w:hanging="1080"/>
+      </w:pPr>
+      <w:rPr>
+        <w:rFonts w:hint="default"/>
+      </w:rPr>
+    </w:lvl>
+    <w:lvl w:ilvl="4">
+      <w:start w:val="1"/>
+      <w:numFmt w:val="decimal"/>
+      <w:lvlText w:val="%1.%2.%3.%4.%5"/>
+      <w:lvlJc w:val="left"/>
+      <w:pPr>
+        <w:ind w:left="1080" w:hanging="1080"/>
+      </w:pPr>
+      <w:rPr>
+        <w:rFonts w:hint="default"/>
+      </w:rPr>
+    </w:lvl>
+    <w:lvl w:ilvl="5">
+      <w:start w:val="1"/>
+      <w:numFmt w:val="decimal"/>
+      <w:lvlText w:val="%1.%2.%3.%4.%5.%6"/>
+      <w:lvlJc w:val="left"/>
+      <w:pPr>
+        <w:ind w:left="1440" w:hanging="1440"/>
+      </w:pPr>
+      <w:rPr>
+        <w:rFonts w:hint="default"/>
+      </w:rPr>
+    </w:lvl>
+    <w:lvl w:ilvl="6">
+      <w:start w:val="1"/>
+      <w:numFmt w:val="decimal"/>
+      <w:lvlText w:val="%1.%2.%3.%4.%5.%6.%7"/>
+      <w:lvlJc w:val="left"/>
+      <w:pPr>
+        <w:ind w:left="1440" w:hanging="1440"/>
+      </w:pPr>
+      <w:rPr>
+        <w:rFonts w:hint="default"/>
+      </w:rPr>
+    </w:lvl>
+    <w:lvl w:ilvl="7">
+      <w:start w:val="1"/>
+      <w:numFmt w:val="decimal"/>
+      <w:lvlText w:val="%1.%2.%3.%4.%5.%6.%7.%8"/>
+      <w:lvlJc w:val="left"/>
+      <w:pPr>
+        <w:ind w:left="1800" w:hanging="1800"/>
+      </w:pPr>
+      <w:rPr>
+        <w:rFonts w:hint="default"/>
+      </w:rPr>
+    </w:lvl>
+    <w:lvl w:ilvl="8">
+      <w:start w:val="1"/>
+      <w:numFmt w:val="decimal"/>
+      <w:lvlText w:val="%1.%2.%3.%4.%5.%6.%7.%8.%9"/>
+      <w:lvlJc w:val="left"/>
+      <w:pPr>
+        <w:ind w:left="1800" w:hanging="1800"/>
+      </w:pPr>
+      <w:rPr>
+        <w:rFonts w:hint="default"/>
+      </w:rPr>
+    </w:lvl>
+  </w:abstractNum>
+  <w:abstractNum w:abstractNumId="18" w15:restartNumberingAfterBreak="0">
+    <w:nsid w:val="25FD1E15"/>
+    <w:multiLevelType w:val="multilevel"/>
+    <w:tmpl w:val="650E4D6E"/>
+    <w:lvl w:ilvl="0">
+      <w:start w:val="6"/>
+      <w:numFmt w:val="decimal"/>
+      <w:lvlText w:val="%1"/>
+      <w:lvlJc w:val="left"/>
+      <w:pPr>
+        <w:ind w:left="360" w:hanging="360"/>
+      </w:pPr>
+      <w:rPr>
+        <w:rFonts w:hint="default"/>
+      </w:rPr>
+    </w:lvl>
+    <w:lvl w:ilvl="1">
+      <w:start w:val="1"/>
+      <w:numFmt w:val="decimal"/>
+      <w:lvlText w:val="%1.%2"/>
+      <w:lvlJc w:val="left"/>
+      <w:pPr>
+        <w:ind w:left="360" w:hanging="360"/>
+      </w:pPr>
+      <w:rPr>
+        <w:rFonts w:hint="default"/>
+      </w:rPr>
+    </w:lvl>
+    <w:lvl w:ilvl="2">
+      <w:start w:val="1"/>
+      <w:numFmt w:val="decimal"/>
+      <w:lvlText w:val="%1.%2.%3"/>
+      <w:lvlJc w:val="left"/>
+      <w:pPr>
+        <w:ind w:left="720" w:hanging="720"/>
+      </w:pPr>
+      <w:rPr>
+        <w:rFonts w:hint="default"/>
+      </w:rPr>
+    </w:lvl>
+    <w:lvl w:ilvl="3">
+      <w:start w:val="1"/>
+      <w:numFmt w:val="decimal"/>
+      <w:lvlText w:val="%1.%2.%3.%4"/>
+      <w:lvlJc w:val="left"/>
+      <w:pPr>
+        <w:ind w:left="1080" w:hanging="1080"/>
+      </w:pPr>
+      <w:rPr>
+        <w:rFonts w:hint="default"/>
+      </w:rPr>
+    </w:lvl>
+    <w:lvl w:ilvl="4">
+      <w:start w:val="1"/>
+      <w:numFmt w:val="decimal"/>
+      <w:lvlText w:val="%1.%2.%3.%4.%5"/>
+      <w:lvlJc w:val="left"/>
+      <w:pPr>
+        <w:ind w:left="1080" w:hanging="1080"/>
+      </w:pPr>
+      <w:rPr>
+        <w:rFonts w:hint="default"/>
+      </w:rPr>
+    </w:lvl>
+    <w:lvl w:ilvl="5">
+      <w:start w:val="1"/>
+      <w:numFmt w:val="decimal"/>
+      <w:lvlText w:val="%1.%2.%3.%4.%5.%6"/>
+      <w:lvlJc w:val="left"/>
+      <w:pPr>
+        <w:ind w:left="1440" w:hanging="1440"/>
+      </w:pPr>
+      <w:rPr>
+        <w:rFonts w:hint="default"/>
+      </w:rPr>
+    </w:lvl>
+    <w:lvl w:ilvl="6">
+      <w:start w:val="1"/>
+      <w:numFmt w:val="decimal"/>
+      <w:lvlText w:val="%1.%2.%3.%4.%5.%6.%7"/>
+      <w:lvlJc w:val="left"/>
+      <w:pPr>
+        <w:ind w:left="1440" w:hanging="1440"/>
+      </w:pPr>
+      <w:rPr>
+        <w:rFonts w:hint="default"/>
+      </w:rPr>
+    </w:lvl>
+    <w:lvl w:ilvl="7">
+      <w:start w:val="1"/>
+      <w:numFmt w:val="decimal"/>
+      <w:lvlText w:val="%1.%2.%3.%4.%5.%6.%7.%8"/>
+      <w:lvlJc w:val="left"/>
+      <w:pPr>
+        <w:ind w:left="1800" w:hanging="1800"/>
+      </w:pPr>
+      <w:rPr>
+        <w:rFonts w:hint="default"/>
+      </w:rPr>
+    </w:lvl>
+    <w:lvl w:ilvl="8">
+      <w:start w:val="1"/>
+      <w:numFmt w:val="decimal"/>
+      <w:lvlText w:val="%1.%2.%3.%4.%5.%6.%7.%8.%9"/>
+      <w:lvlJc w:val="left"/>
+      <w:pPr>
+        <w:ind w:left="1800" w:hanging="1800"/>
+      </w:pPr>
+      <w:rPr>
+        <w:rFonts w:hint="default"/>
+      </w:rPr>
+    </w:lvl>
+  </w:abstractNum>
+  <w:abstractNum w:abstractNumId="19" w15:restartNumberingAfterBreak="0">
     <w:nsid w:val="3D77409A"/>
     <w:multiLevelType w:val="hybridMultilevel"/>
     <w:tmpl w:val="18D066EE"/>
@@ -3155,7 +4209,7 @@
       </w:pPr>
     </w:lvl>
   </w:abstractNum>
-  <w:abstractNum w:abstractNumId="17" w15:restartNumberingAfterBreak="0">
+  <w:abstractNum w:abstractNumId="20" w15:restartNumberingAfterBreak="0">
     <w:nsid w:val="403B66D6"/>
     <w:multiLevelType w:val="hybridMultilevel"/>
     <w:tmpl w:val="DB306C86"/>
@@ -3244,7 +4298,7 @@
       </w:pPr>
     </w:lvl>
   </w:abstractNum>
-  <w:abstractNum w:abstractNumId="18" w15:restartNumberingAfterBreak="0">
+  <w:abstractNum w:abstractNumId="21" w15:restartNumberingAfterBreak="0">
     <w:nsid w:val="45FB638B"/>
     <w:multiLevelType w:val="hybridMultilevel"/>
     <w:tmpl w:val="31C0E728"/>
@@ -3333,7 +4387,120 @@
       </w:pPr>
     </w:lvl>
   </w:abstractNum>
-  <w:abstractNum w:abstractNumId="19" w15:restartNumberingAfterBreak="0">
+  <w:abstractNum w:abstractNumId="22" w15:restartNumberingAfterBreak="0">
+    <w:nsid w:val="4A0E315C"/>
+    <w:multiLevelType w:val="multilevel"/>
+    <w:tmpl w:val="B4BE6CD2"/>
+    <w:lvl w:ilvl="0">
+      <w:start w:val="6"/>
+      <w:numFmt w:val="decimal"/>
+      <w:lvlText w:val="%1"/>
+      <w:lvlJc w:val="left"/>
+      <w:pPr>
+        <w:ind w:left="360" w:hanging="360"/>
+      </w:pPr>
+      <w:rPr>
+        <w:rFonts w:hint="default"/>
+      </w:rPr>
+    </w:lvl>
+    <w:lvl w:ilvl="1">
+      <w:start w:val="1"/>
+      <w:numFmt w:val="decimal"/>
+      <w:lvlText w:val="%1.%2"/>
+      <w:lvlJc w:val="left"/>
+      <w:pPr>
+        <w:ind w:left="360" w:hanging="360"/>
+      </w:pPr>
+      <w:rPr>
+        <w:rFonts w:hint="default"/>
+      </w:rPr>
+    </w:lvl>
+    <w:lvl w:ilvl="2">
+      <w:start w:val="1"/>
+      <w:numFmt w:val="decimal"/>
+      <w:lvlText w:val="%1.%2.%3"/>
+      <w:lvlJc w:val="left"/>
+      <w:pPr>
+        <w:ind w:left="720" w:hanging="720"/>
+      </w:pPr>
+      <w:rPr>
+        <w:rFonts w:hint="default"/>
+      </w:rPr>
+    </w:lvl>
+    <w:lvl w:ilvl="3">
+      <w:start w:val="1"/>
+      <w:numFmt w:val="decimal"/>
+      <w:lvlText w:val="%1.%2.%3.%4"/>
+      <w:lvlJc w:val="left"/>
+      <w:pPr>
+        <w:ind w:left="1080" w:hanging="1080"/>
+      </w:pPr>
+      <w:rPr>
+        <w:rFonts w:hint="default"/>
+      </w:rPr>
+    </w:lvl>
+    <w:lvl w:ilvl="4">
+      <w:start w:val="1"/>
+      <w:numFmt w:val="decimal"/>
+      <w:lvlText w:val="%1.%2.%3.%4.%5"/>
+      <w:lvlJc w:val="left"/>
+      <w:pPr>
+        <w:ind w:left="1080" w:hanging="1080"/>
+      </w:pPr>
+      <w:rPr>
+        <w:rFonts w:hint="default"/>
+      </w:rPr>
+    </w:lvl>
+    <w:lvl w:ilvl="5">
+      <w:start w:val="1"/>
+      <w:numFmt w:val="decimal"/>
+      <w:lvlText w:val="%1.%2.%3.%4.%5.%6"/>
+      <w:lvlJc w:val="left"/>
+      <w:pPr>
+        <w:ind w:left="1440" w:hanging="1440"/>
+      </w:pPr>
+      <w:rPr>
+        <w:rFonts w:hint="default"/>
+      </w:rPr>
+    </w:lvl>
+    <w:lvl w:ilvl="6">
+      <w:start w:val="1"/>
+      <w:numFmt w:val="decimal"/>
+      <w:lvlText w:val="%1.%2.%3.%4.%5.%6.%7"/>
+      <w:lvlJc w:val="left"/>
+      <w:pPr>
+        <w:ind w:left="1440" w:hanging="1440"/>
+      </w:pPr>
+      <w:rPr>
+        <w:rFonts w:hint="default"/>
+      </w:rPr>
+    </w:lvl>
+    <w:lvl w:ilvl="7">
+      <w:start w:val="1"/>
+      <w:numFmt w:val="decimal"/>
+      <w:lvlText w:val="%1.%2.%3.%4.%5.%6.%7.%8"/>
+      <w:lvlJc w:val="left"/>
+      <w:pPr>
+        <w:ind w:left="1800" w:hanging="1800"/>
+      </w:pPr>
+      <w:rPr>
+        <w:rFonts w:hint="default"/>
+      </w:rPr>
+    </w:lvl>
+    <w:lvl w:ilvl="8">
+      <w:start w:val="1"/>
+      <w:numFmt w:val="decimal"/>
+      <w:lvlText w:val="%1.%2.%3.%4.%5.%6.%7.%8.%9"/>
+      <w:lvlJc w:val="left"/>
+      <w:pPr>
+        <w:ind w:left="1800" w:hanging="1800"/>
+      </w:pPr>
+      <w:rPr>
+        <w:rFonts w:hint="default"/>
+      </w:rPr>
+    </w:lvl>
+  </w:abstractNum>
+  <w:abstractNum w:abstractNumId="23" w15:restartNumberingAfterBreak="0">
     <w:nsid w:val="5AAA68A8"/>
     <w:multiLevelType w:val="hybridMultilevel"/>
     <w:tmpl w:val="1B1C49FE"/>
@@ -3422,7 +4589,96 @@
       </w:pPr>
     </w:lvl>
   </w:abstractNum>
-  <w:abstractNum w:abstractNumId="20" w15:restartNumberingAfterBreak="0">
+  <w:abstractNum w:abstractNumId="24" w15:restartNumberingAfterBreak="0">
+    <w:nsid w:val="6E642F95"/>
+    <w:multiLevelType w:val="hybridMultilevel"/>
+    <w:tmpl w:val="EE8C1B12"/>
+    <w:lvl w:ilvl="0" w:tplc="4009000F">
+      <w:start w:val="1"/>
+      <w:numFmt w:val="decimal"/>
+      <w:lvlText w:val="%1."/>
+      <w:lvlJc w:val="left"/>
+      <w:pPr>
+        <w:ind w:left="720" w:hanging="360"/>
+      </w:pPr>
+      <w:rPr>
+        <w:rFonts w:hint="default"/>
+      </w:rPr>
+    </w:lvl>
+    <w:lvl w:ilvl="1" w:tplc="40090019" w:tentative="1">
+      <w:start w:val="1"/>
+      <w:numFmt w:val="lowerLetter"/>
+      <w:lvlText w:val="%2."/>
+      <w:lvlJc w:val="left"/>
+      <w:pPr>
+        <w:ind w:left="1440" w:hanging="360"/>
+      </w:pPr>
+    </w:lvl>
+    <w:lvl w:ilvl="2" w:tplc="4009001B" w:tentative="1">
+      <w:start w:val="1"/>
+      <w:numFmt w:val="lowerRoman"/>
+      <w:lvlText w:val="%3."/>
+      <w:lvlJc w:val="right"/>
+      <w:pPr>
+        <w:ind w:left="2160" w:hanging="180"/>
+      </w:pPr>
+    </w:lvl>
+    <w:lvl w:ilvl="3" w:tplc="4009000F" w:tentative="1">
+      <w:start w:val="1"/>
+      <w:numFmt w:val="decimal"/>
+      <w:lvlText w:val="%4."/>
+      <w:lvlJc w:val="left"/>
+      <w:pPr>
+        <w:ind w:left="2880" w:hanging="360"/>
+      </w:pPr>
+    </w:lvl>
+    <w:lvl w:ilvl="4" w:tplc="40090019" w:tentative="1">
+      <w:start w:val="1"/>
+      <w:numFmt w:val="lowerLetter"/>
+      <w:lvlText w:val="%5."/>
+      <w:lvlJc w:val="left"/>
+      <w:pPr>
+        <w:ind w:left="3600" w:hanging="360"/>
+      </w:pPr>
+    </w:lvl>
+    <w:lvl w:ilvl="5" w:tplc="4009001B" w:tentative="1">
+      <w:start w:val="1"/>
+      <w:numFmt w:val="lowerRoman"/>
+      <w:lvlText w:val="%6."/>
+      <w:lvlJc w:val="right"/>
+      <w:pPr>
+        <w:ind w:left="4320" w:hanging="180"/>
+      </w:pPr>
+    </w:lvl>
+    <w:lvl w:ilvl="6" w:tplc="4009000F" w:tentative="1">
+      <w:start w:val="1"/>
+      <w:numFmt w:val="decimal"/>
+      <w:lvlText w:val="%7."/>
+      <w:lvlJc w:val="left"/>
+      <w:pPr>
+        <w:ind w:left="5040" w:hanging="360"/>
+      </w:pPr>
+    </w:lvl>
+    <w:lvl w:ilvl="7" w:tplc="40090019" w:tentative="1">
+      <w:start w:val="1"/>
+      <w:numFmt w:val="lowerLetter"/>
+      <w:lvlText w:val="%8."/>
+      <w:lvlJc w:val="left"/>
+      <w:pPr>
+        <w:ind w:left="5760" w:hanging="360"/>
+      </w:pPr>
+    </w:lvl>
+    <w:lvl w:ilvl="8" w:tplc="4009001B" w:tentative="1">
+      <w:start w:val="1"/>
+      <w:numFmt w:val="lowerRoman"/>
+      <w:lvlText w:val="%9."/>
+      <w:lvlJc w:val="right"/>
+      <w:pPr>
+        <w:ind w:left="6480" w:hanging="180"/>
+      </w:pPr>
+    </w:lvl>
+  </w:abstractNum>
+  <w:abstractNum w:abstractNumId="25" w15:restartNumberingAfterBreak="0">
     <w:nsid w:val="70412ACB"/>
     <w:multiLevelType w:val="multilevel"/>
     <w:tmpl w:val="F1FAB0C2"/>
@@ -3535,7 +4791,7 @@
       </w:rPr>
     </w:lvl>
   </w:abstractNum>
-  <w:abstractNum w:abstractNumId="21" w15:restartNumberingAfterBreak="0">
+  <w:abstractNum w:abstractNumId="26" w15:restartNumberingAfterBreak="0">
     <w:nsid w:val="7AC525C8"/>
     <w:multiLevelType w:val="hybridMultilevel"/>
     <w:tmpl w:val="7E20EF74"/>
@@ -3652,43 +4908,58 @@
     <w:abstractNumId w:val="0"/>
   </w:num>
   <w:num w:numId="10" w16cid:durableId="988289817">
+    <w:abstractNumId w:val="10"/>
+  </w:num>
+  <w:num w:numId="11" w16cid:durableId="394595768">
+    <w:abstractNumId w:val="15"/>
+  </w:num>
+  <w:num w:numId="12" w16cid:durableId="2116319213">
+    <w:abstractNumId w:val="13"/>
+  </w:num>
+  <w:num w:numId="13" w16cid:durableId="1007437190">
+    <w:abstractNumId w:val="16"/>
+  </w:num>
+  <w:num w:numId="14" w16cid:durableId="1333946547">
+    <w:abstractNumId w:val="25"/>
+  </w:num>
+  <w:num w:numId="15" w16cid:durableId="944577578">
+    <w:abstractNumId w:val="26"/>
+  </w:num>
+  <w:num w:numId="16" w16cid:durableId="1564490615">
+    <w:abstractNumId w:val="14"/>
+  </w:num>
+  <w:num w:numId="17" w16cid:durableId="1268388541">
+    <w:abstractNumId w:val="12"/>
+  </w:num>
+  <w:num w:numId="18" w16cid:durableId="1105156957">
+    <w:abstractNumId w:val="20"/>
+  </w:num>
+  <w:num w:numId="19" w16cid:durableId="973020555">
+    <w:abstractNumId w:val="23"/>
+  </w:num>
+  <w:num w:numId="20" w16cid:durableId="2070422878">
+    <w:abstractNumId w:val="21"/>
+  </w:num>
+  <w:num w:numId="21" w16cid:durableId="1885561352">
+    <w:abstractNumId w:val="19"/>
+  </w:num>
+  <w:num w:numId="22" w16cid:durableId="721825685">
+    <w:abstractNumId w:val="11"/>
+  </w:num>
+  <w:num w:numId="23" w16cid:durableId="742722786">
+    <w:abstractNumId w:val="24"/>
+  </w:num>
+  <w:num w:numId="24" w16cid:durableId="1873490060">
+    <w:abstractNumId w:val="18"/>
+  </w:num>
+  <w:num w:numId="25" w16cid:durableId="317733096">
     <w:abstractNumId w:val="9"/>
   </w:num>
-  <w:num w:numId="11" w16cid:durableId="394595768">
-    <w:abstractNumId w:val="14"/>
+  <w:num w:numId="26" w16cid:durableId="1038580138">
+    <w:abstractNumId w:val="22"/>
   </w:num>
-  <w:num w:numId="12" w16cid:durableId="2116319213">
-    <w:abstractNumId w:val="12"/>
-  </w:num>
-  <w:num w:numId="13" w16cid:durableId="1007437190">
-    <w:abstractNumId w:val="15"/>
-  </w:num>
-  <w:num w:numId="14" w16cid:durableId="1333946547">
-    <w:abstractNumId w:val="20"/>
-  </w:num>
-  <w:num w:numId="15" w16cid:durableId="944577578">
-    <w:abstractNumId w:val="21"/>
-  </w:num>
-  <w:num w:numId="16" w16cid:durableId="1564490615">
-    <w:abstractNumId w:val="13"/>
-  </w:num>
-  <w:num w:numId="17" w16cid:durableId="1268388541">
-    <w:abstractNumId w:val="11"/>
-  </w:num>
-  <w:num w:numId="18" w16cid:durableId="1105156957">
+  <w:num w:numId="27" w16cid:durableId="391972734">
     <w:abstractNumId w:val="17"/>
-  </w:num>
-  <w:num w:numId="19" w16cid:durableId="973020555">
-    <w:abstractNumId w:val="19"/>
-  </w:num>
-  <w:num w:numId="20" w16cid:durableId="2070422878">
-    <w:abstractNumId w:val="18"/>
-  </w:num>
-  <w:num w:numId="21" w16cid:durableId="1885561352">
-    <w:abstractNumId w:val="16"/>
-  </w:num>
-  <w:num w:numId="22" w16cid:durableId="721825685">
-    <w:abstractNumId w:val="10"/>
   </w:num>
 </w:numbering>
 </file>

</xml_diff>

<commit_message>
Updated project structure of in README.md
</commit_message>
<xml_diff>
--- a/ACEest_Assignment1_Deliverables.docx
+++ b/ACEest_Assignment1_Deliverables.docx
@@ -227,6 +227,7 @@
         <w:rPr>
           <w:b/>
           <w:bCs/>
+          <w:noProof/>
           <w:color w:val="EE0000"/>
         </w:rPr>
         <w:drawing>
@@ -508,6 +509,7 @@
       </w:pPr>
       <w:r>
         <w:rPr>
+          <w:noProof/>
           <w:color w:val="EE0000"/>
         </w:rPr>
         <w:drawing>
@@ -561,6 +563,7 @@
       </w:pPr>
       <w:r>
         <w:rPr>
+          <w:noProof/>
           <w:color w:val="EE0000"/>
         </w:rPr>
         <w:drawing>
@@ -632,10 +635,7 @@
       </w:pPr>
       <w:r>
         <w:lastRenderedPageBreak/>
-        <w:t xml:space="preserve">4. </w:t>
-      </w:r>
-      <w:r>
-        <w:t>Application Run</w:t>
+        <w:t>4. Application Run</w:t>
       </w:r>
     </w:p>
     <w:p>
@@ -704,10 +704,7 @@
         <w:t xml:space="preserve">B. </w:t>
       </w:r>
       <w:r>
-        <w:t xml:space="preserve"> </w:t>
-      </w:r>
-      <w:r>
-        <w:t>Create a virtual environment and install dependencies</w:t>
+        <w:t xml:space="preserve"> Create a virtual environment and install dependencies</w:t>
       </w:r>
       <w:r>
         <w:t xml:space="preserve"> </w:t>
@@ -801,6 +798,9 @@
     </w:p>
     <w:p>
       <w:r>
+        <w:rPr>
+          <w:noProof/>
+        </w:rPr>
         <w:drawing>
           <wp:inline distT="0" distB="0" distL="0" distR="0" wp14:anchorId="641F40B8" wp14:editId="7394DD3B">
             <wp:extent cx="5486400" cy="2799080"/>
@@ -877,6 +877,7 @@
       </w:pPr>
       <w:r>
         <w:rPr>
+          <w:noProof/>
           <w:color w:val="EE0000"/>
         </w:rPr>
         <w:drawing>
@@ -1035,6 +1036,7 @@
       </w:pPr>
       <w:r>
         <w:rPr>
+          <w:noProof/>
           <w:color w:val="EE0000"/>
         </w:rPr>
         <w:lastRenderedPageBreak/>
@@ -1132,6 +1134,7 @@
       </w:pPr>
       <w:r>
         <w:rPr>
+          <w:noProof/>
           <w:color w:val="EE0000"/>
         </w:rPr>
         <w:drawing>
@@ -1226,6 +1229,7 @@
       </w:pPr>
       <w:r>
         <w:rPr>
+          <w:noProof/>
           <w:color w:val="EE0000"/>
         </w:rPr>
         <w:drawing>
@@ -1312,10 +1316,7 @@
         <w:pStyle w:val="Heading1"/>
       </w:pPr>
       <w:r>
-        <w:t>5</w:t>
-      </w:r>
-      <w:r>
-        <w:t xml:space="preserve">. Test Suite — </w:t>
+        <w:t xml:space="preserve">5. Test Suite — </w:t>
       </w:r>
       <w:proofErr w:type="spellStart"/>
       <w:r>
@@ -1564,6 +1565,9 @@
         <w:ind w:left="720"/>
       </w:pPr>
       <w:r>
+        <w:rPr>
+          <w:noProof/>
+        </w:rPr>
         <w:lastRenderedPageBreak/>
         <w:drawing>
           <wp:inline distT="0" distB="0" distL="0" distR="0" wp14:anchorId="65E12C5F" wp14:editId="523C2B2B">
@@ -1834,6 +1838,9 @@
         <w:ind w:left="360" w:hanging="360"/>
       </w:pPr>
       <w:r>
+        <w:rPr>
+          <w:noProof/>
+        </w:rPr>
         <w:drawing>
           <wp:inline distT="0" distB="0" distL="0" distR="0" wp14:anchorId="5A96AC0C" wp14:editId="6CCFB3EF">
             <wp:extent cx="5486400" cy="2781935"/>
@@ -1924,6 +1931,9 @@
         <w:ind w:left="720"/>
       </w:pPr>
       <w:r>
+        <w:rPr>
+          <w:noProof/>
+        </w:rPr>
         <w:drawing>
           <wp:inline distT="0" distB="0" distL="0" distR="0" wp14:anchorId="593B5401" wp14:editId="55C68E9B">
             <wp:extent cx="5486400" cy="1057910"/>
@@ -2024,6 +2034,9 @@
         <w:ind w:left="720"/>
       </w:pPr>
       <w:r>
+        <w:rPr>
+          <w:noProof/>
+        </w:rPr>
         <w:drawing>
           <wp:inline distT="0" distB="0" distL="0" distR="0" wp14:anchorId="4B583260" wp14:editId="75803888">
             <wp:extent cx="5486400" cy="1921510"/>
@@ -2101,6 +2114,9 @@
         <w:ind w:left="720"/>
       </w:pPr>
       <w:r>
+        <w:rPr>
+          <w:noProof/>
+        </w:rPr>
         <w:drawing>
           <wp:inline distT="0" distB="0" distL="0" distR="0" wp14:anchorId="210D04C5" wp14:editId="122A17D9">
             <wp:extent cx="5486400" cy="735330"/>
@@ -2151,6 +2167,9 @@
         <w:ind w:left="720"/>
       </w:pPr>
       <w:r>
+        <w:rPr>
+          <w:noProof/>
+        </w:rPr>
         <w:drawing>
           <wp:inline distT="0" distB="0" distL="0" distR="0" wp14:anchorId="1C0E914D" wp14:editId="41B704FF">
             <wp:extent cx="5486400" cy="1765300"/>
@@ -2225,6 +2244,9 @@
         <w:ind w:firstLine="360"/>
       </w:pPr>
       <w:r>
+        <w:rPr>
+          <w:noProof/>
+        </w:rPr>
         <w:lastRenderedPageBreak/>
         <w:drawing>
           <wp:inline distT="0" distB="0" distL="0" distR="0" wp14:anchorId="6C4C2BA7" wp14:editId="67E35A21">
@@ -2423,6 +2445,9 @@
         </w:numPr>
       </w:pPr>
       <w:r>
+        <w:rPr>
+          <w:noProof/>
+        </w:rPr>
         <w:lastRenderedPageBreak/>
         <w:drawing>
           <wp:inline distT="0" distB="0" distL="0" distR="0" wp14:anchorId="35058F3E" wp14:editId="5189D35E">
@@ -2468,6 +2493,9 @@
     </w:p>
     <w:p>
       <w:r>
+        <w:rPr>
+          <w:noProof/>
+        </w:rPr>
         <w:drawing>
           <wp:inline distT="0" distB="0" distL="0" distR="0" wp14:anchorId="4C46F770" wp14:editId="025517F6">
             <wp:extent cx="5486400" cy="2806065"/>
@@ -2540,6 +2568,9 @@
     </w:p>
     <w:p>
       <w:r>
+        <w:rPr>
+          <w:noProof/>
+        </w:rPr>
         <w:lastRenderedPageBreak/>
         <w:drawing>
           <wp:inline distT="0" distB="0" distL="0" distR="0" wp14:anchorId="63ADD82C" wp14:editId="2CD28FDA">
@@ -2592,6 +2623,9 @@
     </w:p>
     <w:p>
       <w:r>
+        <w:rPr>
+          <w:noProof/>
+        </w:rPr>
         <w:drawing>
           <wp:inline distT="0" distB="0" distL="0" distR="0" wp14:anchorId="2D8D18E8" wp14:editId="0664E0EE">
             <wp:extent cx="5486400" cy="2785110"/>
@@ -2661,6 +2695,7 @@
           <w:rFonts w:asciiTheme="minorHAnsi" w:eastAsiaTheme="minorEastAsia" w:hAnsiTheme="minorHAnsi" w:cstheme="minorBidi"/>
           <w:b w:val="0"/>
           <w:bCs w:val="0"/>
+          <w:noProof/>
           <w:color w:val="auto"/>
           <w:sz w:val="22"/>
           <w:szCs w:val="22"/>
@@ -2711,6 +2746,9 @@
     </w:p>
     <w:p>
       <w:r>
+        <w:rPr>
+          <w:noProof/>
+        </w:rPr>
         <w:drawing>
           <wp:inline distT="0" distB="0" distL="0" distR="0" wp14:anchorId="7535921B" wp14:editId="47A0A485">
             <wp:extent cx="5486400" cy="2799080"/>
@@ -2756,6 +2794,9 @@
     </w:p>
     <w:p>
       <w:r>
+        <w:rPr>
+          <w:noProof/>
+        </w:rPr>
         <w:lastRenderedPageBreak/>
         <w:drawing>
           <wp:inline distT="0" distB="0" distL="0" distR="0" wp14:anchorId="28B8C00D" wp14:editId="3C38C671">
@@ -2801,6 +2842,9 @@
     </w:p>
     <w:p>
       <w:r>
+        <w:rPr>
+          <w:noProof/>
+        </w:rPr>
         <w:drawing>
           <wp:inline distT="0" distB="0" distL="0" distR="0" wp14:anchorId="67FA0A7B" wp14:editId="70FC991A">
             <wp:extent cx="5486400" cy="1147445"/>
@@ -2866,6 +2910,17 @@
         </w:r>
       </w:hyperlink>
     </w:p>
+    <w:p>
+      <w:hyperlink r:id="rId44" w:history="1">
+        <w:r>
+          <w:rPr>
+            <w:rStyle w:val="Hyperlink"/>
+          </w:rPr>
+          <w:t>https://github.com/2025tm93239/aceest-fitness/tree/main/Screenshots%20and%20Video</w:t>
+        </w:r>
+      </w:hyperlink>
+    </w:p>
+    <w:p/>
     <w:p/>
     <w:p>
       <w:pPr>
@@ -2940,6 +2995,7 @@
     </w:p>
     <w:p>
       <w:r>
+        <w:lastRenderedPageBreak/>
         <w:t>Jenkins runs on the course Linux VM as a BUILD quality gate. The Pipeline job clones the same repository, performs a clean install and compile, runs pytest on the agent, builds Docker, and runs pytest in the image. Jenkins validates the project in a controlled server environment; GitHub Actions validates on each commit in the cloud.</w:t>
       </w:r>
     </w:p>
@@ -5567,6 +5623,7 @@
   <w:style w:type="character" w:default="1" w:styleId="DefaultParagraphFont">
     <w:name w:val="Default Paragraph Font"/>
     <w:uiPriority w:val="1"/>
+    <w:semiHidden/>
     <w:unhideWhenUsed/>
   </w:style>
   <w:style w:type="table" w:default="1" w:styleId="TableNormal">

</xml_diff>